<commit_message>
Agregar Carga de Ordenes de Compra Especiales
</commit_message>
<xml_diff>
--- a/documentos/RQM_BonosDistribuidores/PROPUESTA FUNCIONAL.docx
+++ b/documentos/RQM_BonosDistribuidores/PROPUESTA FUNCIONAL.docx
@@ -8,8 +8,6 @@
         <w:ind w:left="2832" w:hanging="2832"/>
         <w:jc w:val="center"/>
       </w:pPr>
-      <w:bookmarkStart w:id="0" w:name="_GoBack"/>
-      <w:bookmarkEnd w:id="0"/>
       <w:r>
         <w:t>PROPUESTA FUNCIONAL</w:t>
       </w:r>
@@ -2780,7 +2778,13 @@
         <w:t xml:space="preserve">2.1.1 </w:t>
       </w:r>
       <w:r>
-        <w:t xml:space="preserve">Configuración de </w:t>
+        <w:rPr>
+          <w:highlight w:val="yellow"/>
+        </w:rPr>
+        <w:t>Configuración</w:t>
+      </w:r>
+      <w:r>
+        <w:t xml:space="preserve"> de </w:t>
       </w:r>
       <w:r>
         <w:t>Clientes Distribuidores</w:t>
@@ -4346,7 +4350,13 @@
         <w:t xml:space="preserve"> </w:t>
       </w:r>
       <w:r>
-        <w:t xml:space="preserve">Gestión de Email para Procesos de Bonificación </w:t>
+        <w:rPr>
+          <w:highlight w:val="yellow"/>
+        </w:rPr>
+        <w:t>Gestión de Email para</w:t>
+      </w:r>
+      <w:r>
+        <w:t xml:space="preserve"> Procesos de Bonificación </w:t>
       </w:r>
     </w:p>
     <w:p>
@@ -6119,7 +6129,16 @@
         <w:t>3</w:t>
       </w:r>
       <w:r>
-        <w:t xml:space="preserve"> Gestión de Períodos (Definición de Periodicidad)</w:t>
+        <w:t xml:space="preserve"> </w:t>
+      </w:r>
+      <w:r>
+        <w:rPr>
+          <w:highlight w:val="yellow"/>
+        </w:rPr>
+        <w:t>Gestión de Períodos</w:t>
+      </w:r>
+      <w:r>
+        <w:t xml:space="preserve"> (Definición de Periodicidad)</w:t>
       </w:r>
     </w:p>
     <w:p>
@@ -7310,7 +7329,13 @@
         <w:t>4</w:t>
       </w:r>
       <w:r>
-        <w:t xml:space="preserve"> Gestión de Tipos de Bono</w:t>
+        <w:t xml:space="preserve"> </w:t>
+      </w:r>
+      <w:r>
+        <w:rPr>
+          <w:highlight w:val="yellow"/>
+        </w:rPr>
+        <w:t>Gestión de Tipos de Bono</w:t>
       </w:r>
     </w:p>
     <w:p>
@@ -8193,9 +8218,18 @@
         <w:t>5</w:t>
       </w:r>
       <w:r>
-        <w:t xml:space="preserve"> Gestión de Vigencias</w:t>
-      </w:r>
-      <w:r>
+        <w:t xml:space="preserve"> </w:t>
+      </w:r>
+      <w:r>
+        <w:rPr>
+          <w:highlight w:val="yellow"/>
+        </w:rPr>
+        <w:t>Gestión de Vigencias</w:t>
+      </w:r>
+      <w:r>
+        <w:rPr>
+          <w:highlight w:val="yellow"/>
+        </w:rPr>
         <w:t xml:space="preserve"> para Bonos</w:t>
       </w:r>
     </w:p>
@@ -9792,13 +9826,10 @@
         <w:t>2.1.</w:t>
       </w:r>
       <w:r>
-        <w:t>6</w:t>
-      </w:r>
-      <w:r>
-        <w:t xml:space="preserve"> Gestión de Vigencias</w:t>
-      </w:r>
-      <w:r>
-        <w:t xml:space="preserve"> para Descuentos</w:t>
+        <w:rPr>
+          <w:highlight w:val="yellow"/>
+        </w:rPr>
+        <w:t>6 Gestión de Vigencias para Descuentos</w:t>
       </w:r>
     </w:p>
     <w:p>
@@ -19914,8 +19945,16 @@
         <w:pStyle w:val="Ttulo4"/>
       </w:pPr>
       <w:r>
-        <w:t>2.4.2 Ingreso Manual de Órdenes de Compra Especiales</w:t>
-      </w:r>
+        <w:t xml:space="preserve">2.4.2 </w:t>
+      </w:r>
+      <w:r>
+        <w:rPr>
+          <w:highlight w:val="yellow"/>
+        </w:rPr>
+        <w:t>Ingreso Manual de Órdenes de Compra Especiales</w:t>
+      </w:r>
+      <w:bookmarkStart w:id="0" w:name="_GoBack"/>
+      <w:bookmarkEnd w:id="0"/>
     </w:p>
     <w:p>
       <w:pPr>
@@ -46336,7 +46375,7 @@
 </file>
 
 <file path=customXml/itemProps1.xml><?xml version="1.0" encoding="utf-8"?>
-<ds:datastoreItem xmlns:ds="http://schemas.openxmlformats.org/officeDocument/2006/customXml" ds:itemID="{419F1830-9BB4-443E-96A3-616BF7E15CAD}">
+<ds:datastoreItem xmlns:ds="http://schemas.openxmlformats.org/officeDocument/2006/customXml" ds:itemID="{DC7E70A2-3F2D-4E39-807E-78A2C8899F94}">
   <ds:schemaRefs>
     <ds:schemaRef ds:uri="http://schemas.openxmlformats.org/officeDocument/2006/bibliography"/>
   </ds:schemaRefs>

</xml_diff>

<commit_message>
Gestion de Ordenes Especiales y Conciliacion de Notas Credito.
</commit_message>
<xml_diff>
--- a/documentos/RQM_BonosDistribuidores/PROPUESTA FUNCIONAL.docx
+++ b/documentos/RQM_BonosDistribuidores/PROPUESTA FUNCIONAL.docx
@@ -19951,10 +19951,22 @@
         <w:rPr>
           <w:highlight w:val="yellow"/>
         </w:rPr>
-        <w:t>Ingreso Manual de Órdenes de Compra Especiales</w:t>
+        <w:t>Gestió</w:t>
       </w:r>
       <w:bookmarkStart w:id="0" w:name="_GoBack"/>
       <w:bookmarkEnd w:id="0"/>
+      <w:r>
+        <w:rPr>
+          <w:highlight w:val="yellow"/>
+        </w:rPr>
+        <w:t xml:space="preserve">n </w:t>
+      </w:r>
+      <w:r>
+        <w:rPr>
+          <w:highlight w:val="yellow"/>
+        </w:rPr>
+        <w:t>de Órdenes de Compra Especiales</w:t>
+      </w:r>
     </w:p>
     <w:p>
       <w:pPr>
@@ -21142,7 +21154,7 @@
       </w:pPr>
       <w:r>
         <w:lastRenderedPageBreak/>
-        <w:t>2.4.3 Reconciliación Manual de Nota de Crédito</w:t>
+        <w:t>2.4.3 Reconciliación de Nota de Crédito</w:t>
       </w:r>
     </w:p>
     <w:p>
@@ -46375,7 +46387,7 @@
 </file>
 
 <file path=customXml/itemProps1.xml><?xml version="1.0" encoding="utf-8"?>
-<ds:datastoreItem xmlns:ds="http://schemas.openxmlformats.org/officeDocument/2006/customXml" ds:itemID="{DC7E70A2-3F2D-4E39-807E-78A2C8899F94}">
+<ds:datastoreItem xmlns:ds="http://schemas.openxmlformats.org/officeDocument/2006/customXml" ds:itemID="{5C84DAAA-54A9-4D0E-A792-651D2340AD77}">
   <ds:schemaRefs>
     <ds:schemaRef ds:uri="http://schemas.openxmlformats.org/officeDocument/2006/bibliography"/>
   </ds:schemaRefs>

</xml_diff>

<commit_message>
Se agregan Tareas de Funcionalidad de Consulta de Bono Actual para el Distribuidor
</commit_message>
<xml_diff>
--- a/documentos/RQM_BonosDistribuidores/PROPUESTA FUNCIONAL.docx
+++ b/documentos/RQM_BonosDistribuidores/PROPUESTA FUNCIONAL.docx
@@ -2781,12 +2781,12 @@
         <w:rPr>
           <w:highlight w:val="yellow"/>
         </w:rPr>
-        <w:t>Configuración</w:t>
-      </w:r>
-      <w:r>
-        <w:t xml:space="preserve"> de </w:t>
-      </w:r>
-      <w:r>
+        <w:t xml:space="preserve">Configuración de </w:t>
+      </w:r>
+      <w:r>
+        <w:rPr>
+          <w:highlight w:val="yellow"/>
+        </w:rPr>
         <w:t>Clientes Distribuidores</w:t>
       </w:r>
       <w:r>
@@ -4353,10 +4353,10 @@
         <w:rPr>
           <w:highlight w:val="yellow"/>
         </w:rPr>
-        <w:t>Gestión de Email para</w:t>
-      </w:r>
-      <w:r>
-        <w:t xml:space="preserve"> Procesos de Bonificación </w:t>
+        <w:t>Gestión de Email para Procesos de Bonificación</w:t>
+      </w:r>
+      <w:r>
+        <w:t xml:space="preserve"> </w:t>
       </w:r>
     </w:p>
     <w:p>
@@ -6135,10 +6135,7 @@
         <w:rPr>
           <w:highlight w:val="yellow"/>
         </w:rPr>
-        <w:t>Gestión de Períodos</w:t>
-      </w:r>
-      <w:r>
-        <w:t xml:space="preserve"> (Definición de Periodicidad)</w:t>
+        <w:t>Gestión de Períodos (Definición de Periodicidad)</w:t>
       </w:r>
     </w:p>
     <w:p>
@@ -10893,78 +10890,603 @@
     </w:p>
     <w:p>
       <w:pPr>
-        <w:pStyle w:val="Ttulo3"/>
-      </w:pPr>
-      <w:r>
-        <w:t xml:space="preserve">2.2 Módulo de Consulta de </w:t>
-      </w:r>
-      <w:r>
-        <w:t>Bonificación</w:t>
-      </w:r>
-      <w:r>
-        <w:t xml:space="preserve"> (Distribuidor - Sitio Público)</w:t>
-      </w:r>
-    </w:p>
-    <w:p>
-      <w:pPr>
-        <w:rPr>
-          <w:rFonts w:ascii="Arial" w:eastAsia="Times New Roman" w:hAnsi="Arial" w:cs="Arial"/>
-          <w:color w:val="000000" w:themeColor="text1"/>
-          <w:sz w:val="24"/>
-          <w:szCs w:val="24"/>
-          <w:lang w:eastAsia="es-CO"/>
-        </w:rPr>
-      </w:pPr>
-      <w:r>
-        <w:rPr>
-          <w:rFonts w:ascii="Arial" w:eastAsia="Times New Roman" w:hAnsi="Arial" w:cs="Arial"/>
-          <w:color w:val="000000" w:themeColor="text1"/>
-          <w:sz w:val="24"/>
-          <w:szCs w:val="24"/>
-          <w:lang w:eastAsia="es-CO"/>
-        </w:rPr>
-        <w:t>Este módulo permite a los distribuidores acceder de forma segura a su información de bonificación sin necesidad de contactar a PROMOS.</w:t>
-      </w:r>
-    </w:p>
-    <w:p>
-      <w:pPr>
-        <w:pStyle w:val="Ttulo4"/>
-      </w:pPr>
-      <w:r>
-        <w:t>2.2.1 Autenticación por OTP (</w:t>
-      </w:r>
-      <w:proofErr w:type="spellStart"/>
-      <w:r>
-        <w:t>One</w:t>
-      </w:r>
-      <w:proofErr w:type="spellEnd"/>
-      <w:r>
-        <w:t xml:space="preserve"> Time </w:t>
-      </w:r>
-      <w:proofErr w:type="spellStart"/>
-      <w:r>
-        <w:t>Password</w:t>
-      </w:r>
-      <w:proofErr w:type="spellEnd"/>
-      <w:r>
-        <w:t>)</w:t>
-      </w:r>
-    </w:p>
-    <w:p>
-      <w:pPr>
-        <w:rPr>
-          <w:rFonts w:ascii="Arial" w:eastAsia="Times New Roman" w:hAnsi="Arial" w:cs="Arial"/>
-          <w:color w:val="000000" w:themeColor="text1"/>
-          <w:sz w:val="24"/>
-          <w:szCs w:val="24"/>
-          <w:lang w:eastAsia="es-CO"/>
-        </w:rPr>
-      </w:pPr>
-      <w:r>
-        <w:rPr>
-          <w:rFonts w:ascii="Arial" w:eastAsia="Times New Roman" w:hAnsi="Arial" w:cs="Arial"/>
+        <w:spacing w:before="100" w:beforeAutospacing="1" w:after="100" w:afterAutospacing="1" w:line="240" w:lineRule="auto"/>
+        <w:outlineLvl w:val="2"/>
+        <w:rPr>
+          <w:rFonts w:ascii="Times New Roman" w:eastAsia="Times New Roman" w:hAnsi="Times New Roman" w:cs="Times New Roman"/>
           <w:b/>
           <w:bCs/>
+          <w:sz w:val="27"/>
+          <w:szCs w:val="27"/>
+          <w:lang w:eastAsia="es-CO"/>
+        </w:rPr>
+      </w:pPr>
+      <w:r>
+        <w:rPr>
+          <w:rFonts w:ascii="Times New Roman" w:eastAsia="Times New Roman" w:hAnsi="Times New Roman" w:cs="Times New Roman"/>
+          <w:b/>
+          <w:bCs/>
+          <w:sz w:val="27"/>
+          <w:szCs w:val="27"/>
+          <w:lang w:eastAsia="es-CO"/>
+        </w:rPr>
+        <w:t>2.1.</w:t>
+      </w:r>
+      <w:r>
+        <w:rPr>
+          <w:rFonts w:ascii="Times New Roman" w:eastAsia="Times New Roman" w:hAnsi="Times New Roman" w:cs="Times New Roman"/>
+          <w:b/>
+          <w:bCs/>
+          <w:sz w:val="27"/>
+          <w:szCs w:val="27"/>
+          <w:highlight w:val="yellow"/>
+          <w:lang w:eastAsia="es-CO"/>
+        </w:rPr>
+        <w:t>7</w:t>
+      </w:r>
+      <w:r>
+        <w:rPr>
+          <w:rFonts w:ascii="Times New Roman" w:eastAsia="Times New Roman" w:hAnsi="Times New Roman" w:cs="Times New Roman"/>
+          <w:b/>
+          <w:bCs/>
+          <w:sz w:val="27"/>
+          <w:szCs w:val="27"/>
+          <w:highlight w:val="yellow"/>
+          <w:lang w:eastAsia="es-CO"/>
+        </w:rPr>
+        <w:t xml:space="preserve"> </w:t>
+      </w:r>
+      <w:r>
+        <w:rPr>
+          <w:rFonts w:ascii="Times New Roman" w:eastAsia="Times New Roman" w:hAnsi="Times New Roman" w:cs="Times New Roman"/>
+          <w:b/>
+          <w:bCs/>
+          <w:sz w:val="27"/>
+          <w:szCs w:val="27"/>
+          <w:highlight w:val="yellow"/>
+          <w:lang w:eastAsia="es-CO"/>
+        </w:rPr>
+        <w:t>Creación</w:t>
+      </w:r>
+      <w:r>
+        <w:rPr>
+          <w:rFonts w:ascii="Times New Roman" w:eastAsia="Times New Roman" w:hAnsi="Times New Roman" w:cs="Times New Roman"/>
+          <w:b/>
+          <w:bCs/>
+          <w:sz w:val="27"/>
+          <w:szCs w:val="27"/>
+          <w:highlight w:val="yellow"/>
+          <w:lang w:eastAsia="es-CO"/>
+        </w:rPr>
+        <w:t xml:space="preserve"> de </w:t>
+      </w:r>
+      <w:r>
+        <w:rPr>
+          <w:rFonts w:ascii="Times New Roman" w:eastAsia="Times New Roman" w:hAnsi="Times New Roman" w:cs="Times New Roman"/>
+          <w:b/>
+          <w:bCs/>
+          <w:sz w:val="27"/>
+          <w:szCs w:val="27"/>
+          <w:highlight w:val="yellow"/>
+          <w:lang w:eastAsia="es-CO"/>
+        </w:rPr>
+        <w:t>Pedidos Especiales</w:t>
+      </w:r>
+    </w:p>
+    <w:p>
+      <w:pPr>
+        <w:rPr>
+          <w:rFonts w:ascii="Arial" w:eastAsia="Times New Roman" w:hAnsi="Arial" w:cs="Arial"/>
+          <w:color w:val="000000" w:themeColor="text1"/>
+          <w:sz w:val="24"/>
+          <w:szCs w:val="24"/>
+          <w:lang w:eastAsia="es-CO"/>
+        </w:rPr>
+      </w:pPr>
+      <w:r>
+        <w:rPr>
+          <w:rFonts w:ascii="Arial" w:eastAsia="Times New Roman" w:hAnsi="Arial" w:cs="Arial"/>
+          <w:b/>
+          <w:color w:val="000000" w:themeColor="text1"/>
+          <w:sz w:val="24"/>
+          <w:szCs w:val="24"/>
+          <w:lang w:eastAsia="es-CO"/>
+        </w:rPr>
+        <w:t>Descripción</w:t>
+      </w:r>
+      <w:r>
+        <w:rPr>
+          <w:rFonts w:ascii="Arial" w:eastAsia="Times New Roman" w:hAnsi="Arial" w:cs="Arial"/>
+          <w:color w:val="000000" w:themeColor="text1"/>
+          <w:sz w:val="24"/>
+          <w:szCs w:val="24"/>
+          <w:lang w:eastAsia="es-CO"/>
+        </w:rPr>
+        <w:t>:</w:t>
+      </w:r>
+    </w:p>
+    <w:p>
+      <w:pPr>
+        <w:rPr>
+          <w:rFonts w:ascii="Arial" w:eastAsia="Times New Roman" w:hAnsi="Arial" w:cs="Arial"/>
+          <w:color w:val="000000" w:themeColor="text1"/>
+          <w:sz w:val="24"/>
+          <w:szCs w:val="24"/>
+          <w:lang w:eastAsia="es-CO"/>
+        </w:rPr>
+      </w:pPr>
+      <w:r>
+        <w:rPr>
+          <w:rFonts w:ascii="Arial" w:eastAsia="Times New Roman" w:hAnsi="Arial" w:cs="Arial"/>
+          <w:color w:val="000000" w:themeColor="text1"/>
+          <w:sz w:val="24"/>
+          <w:szCs w:val="24"/>
+          <w:lang w:eastAsia="es-CO"/>
+        </w:rPr>
+        <w:t>Identificar que pedidos deben ser excluidos o incluidos en el cálculo de bonificación para un distribuidor</w:t>
+      </w:r>
+    </w:p>
+    <w:p>
+      <w:pPr>
+        <w:rPr>
+          <w:rFonts w:ascii="Arial" w:eastAsia="Times New Roman" w:hAnsi="Arial" w:cs="Arial"/>
+          <w:color w:val="000000" w:themeColor="text1"/>
+          <w:sz w:val="24"/>
+          <w:szCs w:val="24"/>
+          <w:lang w:eastAsia="es-CO"/>
+        </w:rPr>
+      </w:pPr>
+      <w:r>
+        <w:rPr>
+          <w:rFonts w:ascii="Arial" w:eastAsia="Times New Roman" w:hAnsi="Arial" w:cs="Arial"/>
+          <w:b/>
+          <w:color w:val="000000" w:themeColor="text1"/>
+          <w:sz w:val="24"/>
+          <w:szCs w:val="24"/>
+          <w:lang w:eastAsia="es-CO"/>
+        </w:rPr>
+        <w:t>Funcionalidades</w:t>
+      </w:r>
+      <w:r>
+        <w:rPr>
+          <w:rFonts w:ascii="Arial" w:eastAsia="Times New Roman" w:hAnsi="Arial" w:cs="Arial"/>
+          <w:color w:val="000000" w:themeColor="text1"/>
+          <w:sz w:val="24"/>
+          <w:szCs w:val="24"/>
+          <w:lang w:eastAsia="es-CO"/>
+        </w:rPr>
+        <w:t>:</w:t>
+      </w:r>
+    </w:p>
+    <w:p>
+      <w:pPr>
+        <w:numPr>
+          <w:ilvl w:val="0"/>
+          <w:numId w:val="126"/>
+        </w:numPr>
+        <w:contextualSpacing/>
+        <w:rPr>
+          <w:rFonts w:ascii="Arial" w:eastAsia="Times New Roman" w:hAnsi="Arial" w:cs="Arial"/>
+          <w:color w:val="000000" w:themeColor="text1"/>
+          <w:sz w:val="24"/>
+          <w:szCs w:val="24"/>
+          <w:lang w:eastAsia="es-CO"/>
+        </w:rPr>
+      </w:pPr>
+      <w:r>
+        <w:rPr>
+          <w:rFonts w:ascii="Arial" w:eastAsia="Times New Roman" w:hAnsi="Arial" w:cs="Arial"/>
+          <w:color w:val="000000" w:themeColor="text1"/>
+          <w:sz w:val="24"/>
+          <w:szCs w:val="24"/>
+          <w:lang w:eastAsia="es-CO"/>
+        </w:rPr>
+        <w:t>Marcar pedidos especial</w:t>
+      </w:r>
+    </w:p>
+    <w:p>
+      <w:pPr>
+        <w:numPr>
+          <w:ilvl w:val="0"/>
+          <w:numId w:val="126"/>
+        </w:numPr>
+        <w:contextualSpacing/>
+        <w:rPr>
+          <w:rFonts w:ascii="Arial" w:eastAsia="Times New Roman" w:hAnsi="Arial" w:cs="Arial"/>
+          <w:color w:val="000000" w:themeColor="text1"/>
+          <w:sz w:val="24"/>
+          <w:szCs w:val="24"/>
+          <w:lang w:eastAsia="es-CO"/>
+        </w:rPr>
+      </w:pPr>
+      <w:r>
+        <w:rPr>
+          <w:rFonts w:ascii="Arial" w:eastAsia="Times New Roman" w:hAnsi="Arial" w:cs="Arial"/>
+          <w:color w:val="000000" w:themeColor="text1"/>
+          <w:sz w:val="24"/>
+          <w:szCs w:val="24"/>
+          <w:lang w:eastAsia="es-CO"/>
+        </w:rPr>
+        <w:t>Quitar marca de pedido especial</w:t>
+      </w:r>
+    </w:p>
+    <w:p>
+      <w:pPr>
+        <w:numPr>
+          <w:ilvl w:val="0"/>
+          <w:numId w:val="126"/>
+        </w:numPr>
+        <w:contextualSpacing/>
+        <w:rPr>
+          <w:rFonts w:ascii="Arial" w:eastAsia="Times New Roman" w:hAnsi="Arial" w:cs="Arial"/>
+          <w:color w:val="000000" w:themeColor="text1"/>
+          <w:sz w:val="24"/>
+          <w:szCs w:val="24"/>
+          <w:lang w:eastAsia="es-CO"/>
+        </w:rPr>
+      </w:pPr>
+      <w:r>
+        <w:rPr>
+          <w:rFonts w:ascii="Arial" w:eastAsia="Times New Roman" w:hAnsi="Arial" w:cs="Arial"/>
+          <w:color w:val="000000" w:themeColor="text1"/>
+          <w:sz w:val="24"/>
+          <w:szCs w:val="24"/>
+          <w:lang w:eastAsia="es-CO"/>
+        </w:rPr>
+        <w:lastRenderedPageBreak/>
+        <w:t>Incluir en el cálculo de bonos, solo los pedidos que NO se encuentren marcados como Pedido Especial</w:t>
+      </w:r>
+    </w:p>
+    <w:p>
+      <w:pPr>
+        <w:numPr>
+          <w:ilvl w:val="0"/>
+          <w:numId w:val="126"/>
+        </w:numPr>
+        <w:contextualSpacing/>
+        <w:rPr>
+          <w:rFonts w:ascii="Arial" w:eastAsia="Times New Roman" w:hAnsi="Arial" w:cs="Arial"/>
+          <w:color w:val="000000" w:themeColor="text1"/>
+          <w:sz w:val="24"/>
+          <w:szCs w:val="24"/>
+          <w:lang w:eastAsia="es-CO"/>
+        </w:rPr>
+      </w:pPr>
+      <w:r>
+        <w:rPr>
+          <w:rFonts w:ascii="Arial" w:eastAsia="Times New Roman" w:hAnsi="Arial" w:cs="Arial"/>
+          <w:color w:val="000000" w:themeColor="text1"/>
+          <w:sz w:val="24"/>
+          <w:szCs w:val="24"/>
+          <w:lang w:eastAsia="es-CO"/>
+        </w:rPr>
+        <w:t>Creado el pedido la marca de Pedido especial no puede ser modificada con el pedido.</w:t>
+      </w:r>
+    </w:p>
+    <w:p>
+      <w:pPr>
+        <w:rPr>
+          <w:rFonts w:ascii="Arial" w:eastAsia="Times New Roman" w:hAnsi="Arial" w:cs="Arial"/>
+          <w:color w:val="000000" w:themeColor="text1"/>
+          <w:sz w:val="24"/>
+          <w:szCs w:val="24"/>
+          <w:lang w:eastAsia="es-CO"/>
+        </w:rPr>
+      </w:pPr>
+      <w:r>
+        <w:rPr>
+          <w:rFonts w:ascii="Arial" w:eastAsia="Times New Roman" w:hAnsi="Arial" w:cs="Arial"/>
+          <w:b/>
+          <w:color w:val="000000" w:themeColor="text1"/>
+          <w:sz w:val="24"/>
+          <w:szCs w:val="24"/>
+          <w:lang w:eastAsia="es-CO"/>
+        </w:rPr>
+        <w:t>Conceptos Clave</w:t>
+      </w:r>
+      <w:r>
+        <w:rPr>
+          <w:rFonts w:ascii="Arial" w:eastAsia="Times New Roman" w:hAnsi="Arial" w:cs="Arial"/>
+          <w:color w:val="000000" w:themeColor="text1"/>
+          <w:sz w:val="24"/>
+          <w:szCs w:val="24"/>
+          <w:lang w:eastAsia="es-CO"/>
+        </w:rPr>
+        <w:t>:</w:t>
+      </w:r>
+    </w:p>
+    <w:p>
+      <w:pPr>
+        <w:numPr>
+          <w:ilvl w:val="0"/>
+          <w:numId w:val="130"/>
+        </w:numPr>
+        <w:contextualSpacing/>
+        <w:rPr>
+          <w:rFonts w:ascii="Arial" w:eastAsia="Times New Roman" w:hAnsi="Arial" w:cs="Arial"/>
+          <w:color w:val="000000" w:themeColor="text1"/>
+          <w:sz w:val="24"/>
+          <w:szCs w:val="24"/>
+          <w:lang w:eastAsia="es-CO"/>
+        </w:rPr>
+      </w:pPr>
+      <w:r>
+        <w:rPr>
+          <w:rFonts w:ascii="Arial" w:eastAsia="Times New Roman" w:hAnsi="Arial" w:cs="Arial"/>
+          <w:b/>
+          <w:color w:val="000000" w:themeColor="text1"/>
+          <w:sz w:val="24"/>
+          <w:szCs w:val="24"/>
+          <w:lang w:eastAsia="es-CO"/>
+        </w:rPr>
+        <w:t>Pedido Especial</w:t>
+      </w:r>
+      <w:r>
+        <w:rPr>
+          <w:rFonts w:ascii="Arial" w:eastAsia="Times New Roman" w:hAnsi="Arial" w:cs="Arial"/>
+          <w:color w:val="000000" w:themeColor="text1"/>
+          <w:sz w:val="24"/>
+          <w:szCs w:val="24"/>
+          <w:lang w:eastAsia="es-CO"/>
+        </w:rPr>
+        <w:t xml:space="preserve">: </w:t>
+      </w:r>
+      <w:r>
+        <w:rPr>
+          <w:rFonts w:ascii="Arial" w:eastAsia="Times New Roman" w:hAnsi="Arial" w:cs="Arial"/>
+          <w:color w:val="000000" w:themeColor="text1"/>
+          <w:sz w:val="24"/>
+          <w:szCs w:val="24"/>
+          <w:lang w:eastAsia="es-CO"/>
+        </w:rPr>
+        <w:t>Pedido de un Distribuidor que no se incluye dentro del cálculo de la Bonificación del periodo</w:t>
+      </w:r>
+    </w:p>
+    <w:p>
+      <w:pPr>
+        <w:rPr>
+          <w:rFonts w:ascii="Arial" w:eastAsia="Times New Roman" w:hAnsi="Arial" w:cs="Arial"/>
+          <w:color w:val="000000" w:themeColor="text1"/>
+          <w:sz w:val="24"/>
+          <w:szCs w:val="24"/>
+          <w:lang w:eastAsia="es-CO"/>
+        </w:rPr>
+      </w:pPr>
+      <w:r>
+        <w:rPr>
+          <w:rFonts w:ascii="Arial" w:eastAsia="Times New Roman" w:hAnsi="Arial" w:cs="Arial"/>
+          <w:b/>
+          <w:color w:val="000000" w:themeColor="text1"/>
+          <w:sz w:val="24"/>
+          <w:szCs w:val="24"/>
+          <w:lang w:eastAsia="es-CO"/>
+        </w:rPr>
+        <w:t>Restricciones</w:t>
+      </w:r>
+      <w:r>
+        <w:rPr>
+          <w:rFonts w:ascii="Arial" w:eastAsia="Times New Roman" w:hAnsi="Arial" w:cs="Arial"/>
+          <w:color w:val="000000" w:themeColor="text1"/>
+          <w:sz w:val="24"/>
+          <w:szCs w:val="24"/>
+          <w:lang w:eastAsia="es-CO"/>
+        </w:rPr>
+        <w:t>:</w:t>
+      </w:r>
+    </w:p>
+    <w:p>
+      <w:pPr>
+        <w:numPr>
+          <w:ilvl w:val="0"/>
+          <w:numId w:val="131"/>
+        </w:numPr>
+        <w:contextualSpacing/>
+        <w:rPr>
+          <w:rFonts w:ascii="Arial" w:eastAsia="Times New Roman" w:hAnsi="Arial" w:cs="Arial"/>
+          <w:color w:val="000000" w:themeColor="text1"/>
+          <w:sz w:val="24"/>
+          <w:szCs w:val="24"/>
+          <w:lang w:eastAsia="es-CO"/>
+        </w:rPr>
+      </w:pPr>
+      <w:r>
+        <w:rPr>
+          <w:rFonts w:ascii="Arial" w:eastAsia="Times New Roman" w:hAnsi="Arial" w:cs="Arial"/>
+          <w:color w:val="000000" w:themeColor="text1"/>
+          <w:sz w:val="24"/>
+          <w:szCs w:val="24"/>
+          <w:lang w:eastAsia="es-CO"/>
+        </w:rPr>
+        <w:t>SOLO UNA vigencia ACTIVA en un momento dado</w:t>
+      </w:r>
+    </w:p>
+    <w:p>
+      <w:pPr>
+        <w:numPr>
+          <w:ilvl w:val="0"/>
+          <w:numId w:val="131"/>
+        </w:numPr>
+        <w:contextualSpacing/>
+        <w:rPr>
+          <w:rFonts w:ascii="Arial" w:eastAsia="Times New Roman" w:hAnsi="Arial" w:cs="Arial"/>
+          <w:color w:val="000000" w:themeColor="text1"/>
+          <w:sz w:val="24"/>
+          <w:szCs w:val="24"/>
+          <w:lang w:eastAsia="es-CO"/>
+        </w:rPr>
+      </w:pPr>
+      <w:r>
+        <w:rPr>
+          <w:rFonts w:ascii="Arial" w:eastAsia="Times New Roman" w:hAnsi="Arial" w:cs="Arial"/>
+          <w:color w:val="000000" w:themeColor="text1"/>
+          <w:sz w:val="24"/>
+          <w:szCs w:val="24"/>
+          <w:lang w:eastAsia="es-CO"/>
+        </w:rPr>
+        <w:t>No se puede editar una vigencia que ya está en uso</w:t>
+      </w:r>
+    </w:p>
+    <w:p>
+      <w:pPr>
+        <w:numPr>
+          <w:ilvl w:val="0"/>
+          <w:numId w:val="131"/>
+        </w:numPr>
+        <w:contextualSpacing/>
+        <w:rPr>
+          <w:rFonts w:ascii="Arial" w:eastAsia="Times New Roman" w:hAnsi="Arial" w:cs="Arial"/>
+          <w:color w:val="000000" w:themeColor="text1"/>
+          <w:sz w:val="24"/>
+          <w:szCs w:val="24"/>
+          <w:lang w:eastAsia="es-CO"/>
+        </w:rPr>
+      </w:pPr>
+      <w:r>
+        <w:rPr>
+          <w:rFonts w:ascii="Arial" w:eastAsia="Times New Roman" w:hAnsi="Arial" w:cs="Arial"/>
+          <w:color w:val="000000" w:themeColor="text1"/>
+          <w:sz w:val="24"/>
+          <w:szCs w:val="24"/>
+          <w:lang w:eastAsia="es-CO"/>
+        </w:rPr>
+        <w:t>No se puede crear vigencia con fecha de activación en el pasado</w:t>
+      </w:r>
+    </w:p>
+    <w:p>
+      <w:pPr>
+        <w:rPr>
+          <w:rFonts w:ascii="Arial" w:eastAsia="Times New Roman" w:hAnsi="Arial" w:cs="Arial"/>
+          <w:color w:val="000000" w:themeColor="text1"/>
+          <w:sz w:val="24"/>
+          <w:szCs w:val="24"/>
+          <w:lang w:eastAsia="es-CO"/>
+        </w:rPr>
+      </w:pPr>
+      <w:r>
+        <w:rPr>
+          <w:rFonts w:ascii="Arial" w:eastAsia="Times New Roman" w:hAnsi="Arial" w:cs="Arial"/>
+          <w:color w:val="000000" w:themeColor="text1"/>
+          <w:sz w:val="24"/>
+          <w:szCs w:val="24"/>
+          <w:lang w:eastAsia="es-CO"/>
+        </w:rPr>
+        <w:t>Los rangos de una vigencia NO pueden traslaparse. Cada rango debe tener límites discretos sin sobre posición.</w:t>
+      </w:r>
+    </w:p>
+    <w:p>
+      <w:pPr>
+        <w:rPr>
+          <w:rFonts w:ascii="Arial" w:eastAsia="Times New Roman" w:hAnsi="Arial" w:cs="Arial"/>
+          <w:color w:val="000000" w:themeColor="text1"/>
+          <w:sz w:val="24"/>
+          <w:szCs w:val="24"/>
+          <w:lang w:eastAsia="es-CO"/>
+        </w:rPr>
+      </w:pPr>
+    </w:p>
+    <w:p>
+      <w:pPr>
+        <w:rPr>
+          <w:rFonts w:ascii="Arial" w:eastAsia="Times New Roman" w:hAnsi="Arial" w:cs="Arial"/>
+          <w:color w:val="000000" w:themeColor="text1"/>
+          <w:sz w:val="24"/>
+          <w:szCs w:val="24"/>
+          <w:lang w:eastAsia="es-CO"/>
+        </w:rPr>
+      </w:pPr>
+    </w:p>
+    <w:p>
+      <w:pPr>
+        <w:pStyle w:val="Ttulo3"/>
+      </w:pPr>
+      <w:r>
+        <w:t xml:space="preserve">2.2 Módulo de Consulta de </w:t>
+      </w:r>
+      <w:r>
+        <w:t>Bonificación</w:t>
+      </w:r>
+      <w:r>
+        <w:t xml:space="preserve"> (Distribuidor - Sitio Público)</w:t>
+      </w:r>
+    </w:p>
+    <w:p>
+      <w:pPr>
+        <w:rPr>
+          <w:rFonts w:ascii="Arial" w:eastAsia="Times New Roman" w:hAnsi="Arial" w:cs="Arial"/>
+          <w:color w:val="000000" w:themeColor="text1"/>
+          <w:sz w:val="24"/>
+          <w:szCs w:val="24"/>
+          <w:lang w:eastAsia="es-CO"/>
+        </w:rPr>
+      </w:pPr>
+      <w:r>
+        <w:rPr>
+          <w:rFonts w:ascii="Arial" w:eastAsia="Times New Roman" w:hAnsi="Arial" w:cs="Arial"/>
+          <w:color w:val="000000" w:themeColor="text1"/>
+          <w:sz w:val="24"/>
+          <w:szCs w:val="24"/>
+          <w:lang w:eastAsia="es-CO"/>
+        </w:rPr>
+        <w:t>Este módulo permite a los distribuidores acceder de forma segura a su información de bonificación sin necesidad de contactar a PROMOS.</w:t>
+      </w:r>
+    </w:p>
+    <w:p>
+      <w:pPr>
+        <w:pStyle w:val="Ttulo4"/>
+      </w:pPr>
+      <w:r>
+        <w:t xml:space="preserve">2.2.1 </w:t>
+      </w:r>
+      <w:r>
+        <w:rPr>
+          <w:highlight w:val="yellow"/>
+        </w:rPr>
+        <w:t>Autenticación por OTP (</w:t>
+      </w:r>
+      <w:proofErr w:type="spellStart"/>
+      <w:r>
+        <w:rPr>
+          <w:highlight w:val="yellow"/>
+        </w:rPr>
+        <w:t>One</w:t>
+      </w:r>
+      <w:proofErr w:type="spellEnd"/>
+      <w:r>
+        <w:rPr>
+          <w:highlight w:val="yellow"/>
+        </w:rPr>
+        <w:t xml:space="preserve"> Time </w:t>
+      </w:r>
+      <w:proofErr w:type="spellStart"/>
+      <w:r>
+        <w:rPr>
+          <w:highlight w:val="yellow"/>
+        </w:rPr>
+        <w:t>Password</w:t>
+      </w:r>
+      <w:proofErr w:type="spellEnd"/>
+      <w:r>
+        <w:rPr>
+          <w:highlight w:val="yellow"/>
+        </w:rPr>
+        <w:t>)</w:t>
+      </w:r>
+    </w:p>
+    <w:p>
+      <w:pPr>
+        <w:rPr>
+          <w:rFonts w:ascii="Arial" w:eastAsia="Times New Roman" w:hAnsi="Arial" w:cs="Arial"/>
+          <w:color w:val="000000" w:themeColor="text1"/>
+          <w:sz w:val="24"/>
+          <w:szCs w:val="24"/>
+          <w:lang w:eastAsia="es-CO"/>
+        </w:rPr>
+      </w:pPr>
+      <w:r>
+        <w:rPr>
+          <w:rFonts w:ascii="Arial" w:eastAsia="Times New Roman" w:hAnsi="Arial" w:cs="Arial"/>
+          <w:b/>
+          <w:bCs/>
           <w:color w:val="000000" w:themeColor="text1"/>
           <w:sz w:val="24"/>
           <w:szCs w:val="24"/>
@@ -11004,7 +11526,6 @@
           <w:szCs w:val="24"/>
           <w:lang w:eastAsia="es-CO"/>
         </w:rPr>
-        <w:lastRenderedPageBreak/>
         <w:t>Flujo de Usuario:</w:t>
       </w:r>
     </w:p>
@@ -11507,6 +12028,7 @@
           <w:szCs w:val="24"/>
           <w:lang w:eastAsia="es-CO"/>
         </w:rPr>
+        <w:lastRenderedPageBreak/>
         <w:t>Distribuidor accede a su información de bonificación</w:t>
       </w:r>
     </w:p>
@@ -12193,7 +12715,6 @@
           <w:noProof/>
           <w:lang w:eastAsia="es-CO"/>
         </w:rPr>
-        <w:lastRenderedPageBreak/>
         <w:drawing>
           <wp:inline distT="0" distB="0" distL="0" distR="0" wp14:anchorId="68AF81B9" wp14:editId="30D08AE5">
             <wp:extent cx="2600325" cy="2645158"/>
@@ -12248,6 +12769,7 @@
           <w:noProof/>
           <w:lang w:eastAsia="es-CO"/>
         </w:rPr>
+        <w:lastRenderedPageBreak/>
         <w:drawing>
           <wp:inline distT="0" distB="0" distL="0" distR="0" wp14:anchorId="76C873C5" wp14:editId="323EEE44">
             <wp:extent cx="2524125" cy="2999797"/>
@@ -12290,7 +12812,13 @@
         <w:pStyle w:val="Ttulo4"/>
       </w:pPr>
       <w:r>
-        <w:t>2.2.2 Consulta de Bonificación - Período Actual</w:t>
+        <w:t xml:space="preserve">2.2.2 </w:t>
+      </w:r>
+      <w:r>
+        <w:rPr>
+          <w:highlight w:val="yellow"/>
+        </w:rPr>
+        <w:t>Consulta de Bonificación - Período Actual</w:t>
       </w:r>
     </w:p>
     <w:p>
@@ -12528,7 +13056,6 @@
           <w:szCs w:val="24"/>
           <w:lang w:eastAsia="es-CO"/>
         </w:rPr>
-        <w:lastRenderedPageBreak/>
         <w:t>Sistema muestra:</w:t>
       </w:r>
     </w:p>
@@ -12913,6 +13440,7 @@
           <w:szCs w:val="24"/>
           <w:lang w:eastAsia="es-CO"/>
         </w:rPr>
+        <w:lastRenderedPageBreak/>
         <w:t>Información Mostrada:</w:t>
       </w:r>
     </w:p>
@@ -13506,6 +14034,8 @@
       <w:r>
         <w:t xml:space="preserve">2.2.3 </w:t>
       </w:r>
+      <w:bookmarkStart w:id="0" w:name="_GoBack"/>
+      <w:bookmarkEnd w:id="0"/>
       <w:r>
         <w:t>Notificaciones Automáticas Integradas:</w:t>
       </w:r>
@@ -13622,7 +14152,6 @@
           <w:szCs w:val="24"/>
           <w:lang w:eastAsia="es-CO"/>
         </w:rPr>
-        <w:lastRenderedPageBreak/>
         <w:t>Contenido:</w:t>
       </w:r>
       <w:r>
@@ -13864,6 +14393,7 @@
           <w:szCs w:val="24"/>
           <w:lang w:eastAsia="es-CO"/>
         </w:rPr>
+        <w:lastRenderedPageBreak/>
         <w:t>Configuración:</w:t>
       </w:r>
       <w:r>
@@ -15628,7 +16158,13 @@
         <w:pStyle w:val="Ttulo4"/>
       </w:pPr>
       <w:r>
-        <w:t>2.3.1 Obtener Facturación de TOTUS</w:t>
+        <w:t xml:space="preserve">2.3.1 </w:t>
+      </w:r>
+      <w:r>
+        <w:rPr>
+          <w:highlight w:val="yellow"/>
+        </w:rPr>
+        <w:t>Obtener Facturación de TOTUS</w:t>
       </w:r>
     </w:p>
     <w:p>
@@ -19951,15 +20487,7 @@
         <w:rPr>
           <w:highlight w:val="yellow"/>
         </w:rPr>
-        <w:t>Gestió</w:t>
-      </w:r>
-      <w:bookmarkStart w:id="0" w:name="_GoBack"/>
-      <w:bookmarkEnd w:id="0"/>
-      <w:r>
-        <w:rPr>
-          <w:highlight w:val="yellow"/>
-        </w:rPr>
-        <w:t xml:space="preserve">n </w:t>
+        <w:t xml:space="preserve">Gestión </w:t>
       </w:r>
       <w:r>
         <w:rPr>
@@ -21154,7 +21682,13 @@
       </w:pPr>
       <w:r>
         <w:lastRenderedPageBreak/>
-        <w:t>2.4.3 Reconciliación de Nota de Crédito</w:t>
+        <w:t xml:space="preserve">2.4.3 </w:t>
+      </w:r>
+      <w:r>
+        <w:rPr>
+          <w:highlight w:val="yellow"/>
+        </w:rPr>
+        <w:t>Reconciliación de Nota de Crédito</w:t>
       </w:r>
     </w:p>
     <w:p>
@@ -46387,7 +46921,7 @@
 </file>
 
 <file path=customXml/itemProps1.xml><?xml version="1.0" encoding="utf-8"?>
-<ds:datastoreItem xmlns:ds="http://schemas.openxmlformats.org/officeDocument/2006/customXml" ds:itemID="{5C84DAAA-54A9-4D0E-A792-651D2340AD77}">
+<ds:datastoreItem xmlns:ds="http://schemas.openxmlformats.org/officeDocument/2006/customXml" ds:itemID="{70FDA5F2-C684-4298-A227-E296DC7CB6A1}">
   <ds:schemaRefs>
     <ds:schemaRef ds:uri="http://schemas.openxmlformats.org/officeDocument/2006/bibliography"/>
   </ds:schemaRefs>

</xml_diff>

<commit_message>
Generacion de la Propuesta Economica Final
</commit_message>
<xml_diff>
--- a/documentos/RQM_BonosDistribuidores/PROPUESTA FUNCIONAL.docx
+++ b/documentos/RQM_BonosDistribuidores/PROPUESTA FUNCIONAL.docx
@@ -2735,7 +2735,10 @@
         <w:pStyle w:val="Ttulo3"/>
       </w:pPr>
       <w:r>
-        <w:t xml:space="preserve">2.1 Módulo de Administración (Usuario PROMOS - </w:t>
+        <w:t xml:space="preserve">2.1 </w:t>
+      </w:r>
+      <w:r>
+        <w:t xml:space="preserve">Módulo de Administración (Usuario PROMOS - </w:t>
       </w:r>
       <w:proofErr w:type="spellStart"/>
       <w:r>
@@ -2775,28 +2778,13 @@
         <w:pStyle w:val="Ttulo4"/>
       </w:pPr>
       <w:r>
-        <w:t xml:space="preserve">2.1.1 </w:t>
-      </w:r>
-      <w:r>
-        <w:rPr>
-          <w:highlight w:val="yellow"/>
-        </w:rPr>
-        <w:t xml:space="preserve">Configuración de </w:t>
-      </w:r>
-      <w:r>
-        <w:rPr>
-          <w:highlight w:val="yellow"/>
-        </w:rPr>
+        <w:t xml:space="preserve">2.1.1 Configuración de </w:t>
+      </w:r>
+      <w:r>
         <w:t>Clientes Distribuidores</w:t>
       </w:r>
       <w:r>
-        <w:t xml:space="preserve"> (Definición de </w:t>
-      </w:r>
-      <w:r>
-        <w:t>Distribuidores</w:t>
-      </w:r>
-      <w:r>
-        <w:t>)</w:t>
+        <w:t xml:space="preserve"> (Definición de Distribuidores)</w:t>
       </w:r>
     </w:p>
     <w:p>
@@ -4350,9 +4338,6 @@
         <w:t xml:space="preserve"> </w:t>
       </w:r>
       <w:r>
-        <w:rPr>
-          <w:highlight w:val="yellow"/>
-        </w:rPr>
         <w:t>Gestión de Email para Procesos de Bonificación</w:t>
       </w:r>
       <w:r>
@@ -6126,16 +6111,7 @@
         <w:t>2.1.</w:t>
       </w:r>
       <w:r>
-        <w:t>3</w:t>
-      </w:r>
-      <w:r>
-        <w:t xml:space="preserve"> </w:t>
-      </w:r>
-      <w:r>
-        <w:rPr>
-          <w:highlight w:val="yellow"/>
-        </w:rPr>
-        <w:t>Gestión de Períodos (Definición de Periodicidad)</w:t>
+        <w:t>3 Gestión de Períodos (Definición de Periodicidad)</w:t>
       </w:r>
     </w:p>
     <w:p>
@@ -6781,6 +6757,15 @@
       <w:pPr>
         <w:rPr>
           <w:rFonts w:ascii="Arial" w:eastAsia="Times New Roman" w:hAnsi="Arial" w:cs="Arial"/>
+          <w:color w:val="000000" w:themeColor="text1"/>
+          <w:sz w:val="24"/>
+          <w:szCs w:val="24"/>
+          <w:lang w:eastAsia="es-CO"/>
+        </w:rPr>
+      </w:pPr>
+      <w:r>
+        <w:rPr>
+          <w:rFonts w:ascii="Arial" w:eastAsia="Times New Roman" w:hAnsi="Arial" w:cs="Arial"/>
           <w:b/>
           <w:bCs/>
           <w:color w:val="000000" w:themeColor="text1"/>
@@ -6788,10 +6773,16 @@
           <w:szCs w:val="24"/>
           <w:lang w:eastAsia="es-CO"/>
         </w:rPr>
-      </w:pPr>
-    </w:p>
-    <w:p>
-      <w:pPr>
+        <w:t>Conceptos Clave:</w:t>
+      </w:r>
+    </w:p>
+    <w:p>
+      <w:pPr>
+        <w:pStyle w:val="Prrafodelista"/>
+        <w:numPr>
+          <w:ilvl w:val="0"/>
+          <w:numId w:val="8"/>
+        </w:numPr>
         <w:rPr>
           <w:rFonts w:ascii="Arial" w:eastAsia="Times New Roman" w:hAnsi="Arial" w:cs="Arial"/>
           <w:color w:val="000000" w:themeColor="text1"/>
@@ -6810,24 +6801,8 @@
           <w:szCs w:val="24"/>
           <w:lang w:eastAsia="es-CO"/>
         </w:rPr>
-        <w:t>Conceptos Clave:</w:t>
-      </w:r>
-    </w:p>
-    <w:p>
-      <w:pPr>
-        <w:pStyle w:val="Prrafodelista"/>
-        <w:numPr>
-          <w:ilvl w:val="0"/>
-          <w:numId w:val="8"/>
-        </w:numPr>
-        <w:rPr>
-          <w:rFonts w:ascii="Arial" w:eastAsia="Times New Roman" w:hAnsi="Arial" w:cs="Arial"/>
-          <w:color w:val="000000" w:themeColor="text1"/>
-          <w:sz w:val="24"/>
-          <w:szCs w:val="24"/>
-          <w:lang w:eastAsia="es-CO"/>
-        </w:rPr>
-      </w:pPr>
+        <w:t>Período (</w:t>
+      </w:r>
       <w:r>
         <w:rPr>
           <w:rFonts w:ascii="Arial" w:eastAsia="Times New Roman" w:hAnsi="Arial" w:cs="Arial"/>
@@ -6838,7 +6813,7 @@
           <w:szCs w:val="24"/>
           <w:lang w:eastAsia="es-CO"/>
         </w:rPr>
-        <w:t>Período (</w:t>
+        <w:t>Plantilla</w:t>
       </w:r>
       <w:r>
         <w:rPr>
@@ -6850,8 +6825,56 @@
           <w:szCs w:val="24"/>
           <w:lang w:eastAsia="es-CO"/>
         </w:rPr>
-        <w:t>Plantilla</w:t>
-      </w:r>
+        <w:t>)</w:t>
+      </w:r>
+      <w:r>
+        <w:rPr>
+          <w:rFonts w:ascii="Arial" w:eastAsia="Times New Roman" w:hAnsi="Arial" w:cs="Arial"/>
+          <w:color w:val="000000" w:themeColor="text1"/>
+          <w:sz w:val="24"/>
+          <w:szCs w:val="24"/>
+          <w:lang w:eastAsia="es-CO"/>
+        </w:rPr>
+        <w:t>: Definición de periodicidad reutilizable (</w:t>
+      </w:r>
+      <w:proofErr w:type="spellStart"/>
+      <w:r>
+        <w:rPr>
+          <w:rFonts w:ascii="Arial" w:eastAsia="Times New Roman" w:hAnsi="Arial" w:cs="Arial"/>
+          <w:color w:val="000000" w:themeColor="text1"/>
+          <w:sz w:val="24"/>
+          <w:szCs w:val="24"/>
+          <w:lang w:eastAsia="es-CO"/>
+        </w:rPr>
+        <w:t>ej</w:t>
+      </w:r>
+      <w:proofErr w:type="spellEnd"/>
+      <w:r>
+        <w:rPr>
+          <w:rFonts w:ascii="Arial" w:eastAsia="Times New Roman" w:hAnsi="Arial" w:cs="Arial"/>
+          <w:color w:val="000000" w:themeColor="text1"/>
+          <w:sz w:val="24"/>
+          <w:szCs w:val="24"/>
+          <w:lang w:eastAsia="es-CO"/>
+        </w:rPr>
+        <w:t>: "Quincena PROMOS" = 15 días)</w:t>
+      </w:r>
+    </w:p>
+    <w:p>
+      <w:pPr>
+        <w:pStyle w:val="Prrafodelista"/>
+        <w:numPr>
+          <w:ilvl w:val="0"/>
+          <w:numId w:val="8"/>
+        </w:numPr>
+        <w:rPr>
+          <w:rFonts w:ascii="Arial" w:eastAsia="Times New Roman" w:hAnsi="Arial" w:cs="Arial"/>
+          <w:color w:val="000000" w:themeColor="text1"/>
+          <w:sz w:val="24"/>
+          <w:szCs w:val="24"/>
+          <w:lang w:eastAsia="es-CO"/>
+        </w:rPr>
+      </w:pPr>
       <w:r>
         <w:rPr>
           <w:rFonts w:ascii="Arial" w:eastAsia="Times New Roman" w:hAnsi="Arial" w:cs="Arial"/>
@@ -6862,17 +6885,17 @@
           <w:szCs w:val="24"/>
           <w:lang w:eastAsia="es-CO"/>
         </w:rPr>
-        <w:t>)</w:t>
-      </w:r>
-      <w:r>
-        <w:rPr>
-          <w:rFonts w:ascii="Arial" w:eastAsia="Times New Roman" w:hAnsi="Arial" w:cs="Arial"/>
-          <w:color w:val="000000" w:themeColor="text1"/>
-          <w:sz w:val="24"/>
-          <w:szCs w:val="24"/>
-          <w:lang w:eastAsia="es-CO"/>
-        </w:rPr>
-        <w:t>: Definición de periodicidad reutilizable (</w:t>
+        <w:t>Instancia de Período</w:t>
+      </w:r>
+      <w:r>
+        <w:rPr>
+          <w:rFonts w:ascii="Arial" w:eastAsia="Times New Roman" w:hAnsi="Arial" w:cs="Arial"/>
+          <w:color w:val="000000" w:themeColor="text1"/>
+          <w:sz w:val="24"/>
+          <w:szCs w:val="24"/>
+          <w:lang w:eastAsia="es-CO"/>
+        </w:rPr>
+        <w:t>: Período activo con fechas específicas (</w:t>
       </w:r>
       <w:proofErr w:type="spellStart"/>
       <w:r>
@@ -6894,7 +6917,7 @@
           <w:szCs w:val="24"/>
           <w:lang w:eastAsia="es-CO"/>
         </w:rPr>
-        <w:t>: "Quincena PROMOS" = 15 días)</w:t>
+        <w:t>: "QUI-2026-01" del 01/01/2026 al 15/01/2026)</w:t>
       </w:r>
     </w:p>
     <w:p>
@@ -6915,72 +6938,12 @@
       <w:r>
         <w:rPr>
           <w:rFonts w:ascii="Arial" w:eastAsia="Times New Roman" w:hAnsi="Arial" w:cs="Arial"/>
-          <w:b/>
-          <w:bCs/>
           <w:color w:val="000000" w:themeColor="text1"/>
           <w:sz w:val="24"/>
           <w:szCs w:val="24"/>
           <w:lang w:eastAsia="es-CO"/>
         </w:rPr>
         <w:lastRenderedPageBreak/>
-        <w:t>Instancia de Período</w:t>
-      </w:r>
-      <w:r>
-        <w:rPr>
-          <w:rFonts w:ascii="Arial" w:eastAsia="Times New Roman" w:hAnsi="Arial" w:cs="Arial"/>
-          <w:color w:val="000000" w:themeColor="text1"/>
-          <w:sz w:val="24"/>
-          <w:szCs w:val="24"/>
-          <w:lang w:eastAsia="es-CO"/>
-        </w:rPr>
-        <w:t>: Período activo con fechas específicas (</w:t>
-      </w:r>
-      <w:proofErr w:type="spellStart"/>
-      <w:r>
-        <w:rPr>
-          <w:rFonts w:ascii="Arial" w:eastAsia="Times New Roman" w:hAnsi="Arial" w:cs="Arial"/>
-          <w:color w:val="000000" w:themeColor="text1"/>
-          <w:sz w:val="24"/>
-          <w:szCs w:val="24"/>
-          <w:lang w:eastAsia="es-CO"/>
-        </w:rPr>
-        <w:t>ej</w:t>
-      </w:r>
-      <w:proofErr w:type="spellEnd"/>
-      <w:r>
-        <w:rPr>
-          <w:rFonts w:ascii="Arial" w:eastAsia="Times New Roman" w:hAnsi="Arial" w:cs="Arial"/>
-          <w:color w:val="000000" w:themeColor="text1"/>
-          <w:sz w:val="24"/>
-          <w:szCs w:val="24"/>
-          <w:lang w:eastAsia="es-CO"/>
-        </w:rPr>
-        <w:t>: "QUI-2026-01" del 01/01/2026 al 15/01/2026)</w:t>
-      </w:r>
-    </w:p>
-    <w:p>
-      <w:pPr>
-        <w:pStyle w:val="Prrafodelista"/>
-        <w:numPr>
-          <w:ilvl w:val="0"/>
-          <w:numId w:val="8"/>
-        </w:numPr>
-        <w:rPr>
-          <w:rFonts w:ascii="Arial" w:eastAsia="Times New Roman" w:hAnsi="Arial" w:cs="Arial"/>
-          <w:color w:val="000000" w:themeColor="text1"/>
-          <w:sz w:val="24"/>
-          <w:szCs w:val="24"/>
-          <w:lang w:eastAsia="es-CO"/>
-        </w:rPr>
-      </w:pPr>
-      <w:r>
-        <w:rPr>
-          <w:rFonts w:ascii="Arial" w:eastAsia="Times New Roman" w:hAnsi="Arial" w:cs="Arial"/>
-          <w:color w:val="000000" w:themeColor="text1"/>
-          <w:sz w:val="24"/>
-          <w:szCs w:val="24"/>
-          <w:lang w:eastAsia="es-CO"/>
-        </w:rPr>
         <w:t>La </w:t>
       </w:r>
       <w:r>
@@ -7316,6 +7279,19 @@
     </w:p>
     <w:p>
       <w:pPr>
+        <w:rPr>
+          <w:rFonts w:ascii="Arial" w:eastAsia="Times New Roman" w:hAnsi="Arial" w:cs="Arial"/>
+          <w:b/>
+          <w:bCs/>
+          <w:color w:val="000000" w:themeColor="text1"/>
+          <w:sz w:val="24"/>
+          <w:szCs w:val="24"/>
+          <w:lang w:eastAsia="es-CO"/>
+        </w:rPr>
+      </w:pPr>
+    </w:p>
+    <w:p>
+      <w:pPr>
         <w:pStyle w:val="Ttulo4"/>
       </w:pPr>
       <w:r>
@@ -7329,9 +7305,6 @@
         <w:t xml:space="preserve"> </w:t>
       </w:r>
       <w:r>
-        <w:rPr>
-          <w:highlight w:val="yellow"/>
-        </w:rPr>
         <w:t>Gestión de Tipos de Bono</w:t>
       </w:r>
     </w:p>
@@ -8218,15 +8191,9 @@
         <w:t xml:space="preserve"> </w:t>
       </w:r>
       <w:r>
-        <w:rPr>
-          <w:highlight w:val="yellow"/>
-        </w:rPr>
         <w:t>Gestión de Vigencias</w:t>
       </w:r>
       <w:r>
-        <w:rPr>
-          <w:highlight w:val="yellow"/>
-        </w:rPr>
         <w:t xml:space="preserve"> para Bonos</w:t>
       </w:r>
     </w:p>
@@ -9823,9 +9790,6 @@
         <w:t>2.1.</w:t>
       </w:r>
       <w:r>
-        <w:rPr>
-          <w:highlight w:val="yellow"/>
-        </w:rPr>
         <w:t>6 Gestión de Vigencias para Descuentos</w:t>
       </w:r>
     </w:p>
@@ -10919,1139 +10883,1053 @@
           <w:bCs/>
           <w:sz w:val="27"/>
           <w:szCs w:val="27"/>
-          <w:highlight w:val="yellow"/>
-          <w:lang w:eastAsia="es-CO"/>
-        </w:rPr>
-        <w:t>7</w:t>
-      </w:r>
-      <w:r>
-        <w:rPr>
-          <w:rFonts w:ascii="Times New Roman" w:eastAsia="Times New Roman" w:hAnsi="Times New Roman" w:cs="Times New Roman"/>
+          <w:lang w:eastAsia="es-CO"/>
+        </w:rPr>
+        <w:t>7 Creación de Pedidos Especiales</w:t>
+      </w:r>
+    </w:p>
+    <w:p>
+      <w:pPr>
+        <w:rPr>
+          <w:rFonts w:ascii="Arial" w:eastAsia="Times New Roman" w:hAnsi="Arial" w:cs="Arial"/>
+          <w:color w:val="000000" w:themeColor="text1"/>
+          <w:sz w:val="24"/>
+          <w:szCs w:val="24"/>
+          <w:lang w:eastAsia="es-CO"/>
+        </w:rPr>
+      </w:pPr>
+      <w:r>
+        <w:rPr>
+          <w:rFonts w:ascii="Arial" w:eastAsia="Times New Roman" w:hAnsi="Arial" w:cs="Arial"/>
+          <w:b/>
+          <w:color w:val="000000" w:themeColor="text1"/>
+          <w:sz w:val="24"/>
+          <w:szCs w:val="24"/>
+          <w:lang w:eastAsia="es-CO"/>
+        </w:rPr>
+        <w:t>Descripción</w:t>
+      </w:r>
+      <w:r>
+        <w:rPr>
+          <w:rFonts w:ascii="Arial" w:eastAsia="Times New Roman" w:hAnsi="Arial" w:cs="Arial"/>
+          <w:color w:val="000000" w:themeColor="text1"/>
+          <w:sz w:val="24"/>
+          <w:szCs w:val="24"/>
+          <w:lang w:eastAsia="es-CO"/>
+        </w:rPr>
+        <w:t>:</w:t>
+      </w:r>
+    </w:p>
+    <w:p>
+      <w:pPr>
+        <w:rPr>
+          <w:rFonts w:ascii="Arial" w:eastAsia="Times New Roman" w:hAnsi="Arial" w:cs="Arial"/>
+          <w:color w:val="000000" w:themeColor="text1"/>
+          <w:sz w:val="24"/>
+          <w:szCs w:val="24"/>
+          <w:lang w:eastAsia="es-CO"/>
+        </w:rPr>
+      </w:pPr>
+      <w:r>
+        <w:rPr>
+          <w:rFonts w:ascii="Arial" w:eastAsia="Times New Roman" w:hAnsi="Arial" w:cs="Arial"/>
+          <w:color w:val="000000" w:themeColor="text1"/>
+          <w:sz w:val="24"/>
+          <w:szCs w:val="24"/>
+          <w:lang w:eastAsia="es-CO"/>
+        </w:rPr>
+        <w:t>Identificar que pedidos deben ser excluidos o incluidos en el cálculo de bonificación para un distribuidor</w:t>
+      </w:r>
+    </w:p>
+    <w:p>
+      <w:pPr>
+        <w:rPr>
+          <w:rFonts w:ascii="Arial" w:eastAsia="Times New Roman" w:hAnsi="Arial" w:cs="Arial"/>
+          <w:color w:val="000000" w:themeColor="text1"/>
+          <w:sz w:val="24"/>
+          <w:szCs w:val="24"/>
+          <w:lang w:eastAsia="es-CO"/>
+        </w:rPr>
+      </w:pPr>
+      <w:r>
+        <w:rPr>
+          <w:rFonts w:ascii="Arial" w:eastAsia="Times New Roman" w:hAnsi="Arial" w:cs="Arial"/>
+          <w:b/>
+          <w:color w:val="000000" w:themeColor="text1"/>
+          <w:sz w:val="24"/>
+          <w:szCs w:val="24"/>
+          <w:lang w:eastAsia="es-CO"/>
+        </w:rPr>
+        <w:t>Funcionalidades</w:t>
+      </w:r>
+      <w:r>
+        <w:rPr>
+          <w:rFonts w:ascii="Arial" w:eastAsia="Times New Roman" w:hAnsi="Arial" w:cs="Arial"/>
+          <w:color w:val="000000" w:themeColor="text1"/>
+          <w:sz w:val="24"/>
+          <w:szCs w:val="24"/>
+          <w:lang w:eastAsia="es-CO"/>
+        </w:rPr>
+        <w:t>:</w:t>
+      </w:r>
+    </w:p>
+    <w:p>
+      <w:pPr>
+        <w:numPr>
+          <w:ilvl w:val="0"/>
+          <w:numId w:val="126"/>
+        </w:numPr>
+        <w:contextualSpacing/>
+        <w:rPr>
+          <w:rFonts w:ascii="Arial" w:eastAsia="Times New Roman" w:hAnsi="Arial" w:cs="Arial"/>
+          <w:color w:val="000000" w:themeColor="text1"/>
+          <w:sz w:val="24"/>
+          <w:szCs w:val="24"/>
+          <w:lang w:eastAsia="es-CO"/>
+        </w:rPr>
+      </w:pPr>
+      <w:r>
+        <w:rPr>
+          <w:rFonts w:ascii="Arial" w:eastAsia="Times New Roman" w:hAnsi="Arial" w:cs="Arial"/>
+          <w:color w:val="000000" w:themeColor="text1"/>
+          <w:sz w:val="24"/>
+          <w:szCs w:val="24"/>
+          <w:lang w:eastAsia="es-CO"/>
+        </w:rPr>
+        <w:t>Marcar pedidos especial</w:t>
+      </w:r>
+    </w:p>
+    <w:p>
+      <w:pPr>
+        <w:numPr>
+          <w:ilvl w:val="0"/>
+          <w:numId w:val="126"/>
+        </w:numPr>
+        <w:contextualSpacing/>
+        <w:rPr>
+          <w:rFonts w:ascii="Arial" w:eastAsia="Times New Roman" w:hAnsi="Arial" w:cs="Arial"/>
+          <w:color w:val="000000" w:themeColor="text1"/>
+          <w:sz w:val="24"/>
+          <w:szCs w:val="24"/>
+          <w:lang w:eastAsia="es-CO"/>
+        </w:rPr>
+      </w:pPr>
+      <w:r>
+        <w:rPr>
+          <w:rFonts w:ascii="Arial" w:eastAsia="Times New Roman" w:hAnsi="Arial" w:cs="Arial"/>
+          <w:color w:val="000000" w:themeColor="text1"/>
+          <w:sz w:val="24"/>
+          <w:szCs w:val="24"/>
+          <w:lang w:eastAsia="es-CO"/>
+        </w:rPr>
+        <w:t>Quitar marca de pedido especial</w:t>
+      </w:r>
+    </w:p>
+    <w:p>
+      <w:pPr>
+        <w:numPr>
+          <w:ilvl w:val="0"/>
+          <w:numId w:val="126"/>
+        </w:numPr>
+        <w:contextualSpacing/>
+        <w:rPr>
+          <w:rFonts w:ascii="Arial" w:eastAsia="Times New Roman" w:hAnsi="Arial" w:cs="Arial"/>
+          <w:color w:val="000000" w:themeColor="text1"/>
+          <w:sz w:val="24"/>
+          <w:szCs w:val="24"/>
+          <w:lang w:eastAsia="es-CO"/>
+        </w:rPr>
+      </w:pPr>
+      <w:r>
+        <w:rPr>
+          <w:rFonts w:ascii="Arial" w:eastAsia="Times New Roman" w:hAnsi="Arial" w:cs="Arial"/>
+          <w:color w:val="000000" w:themeColor="text1"/>
+          <w:sz w:val="24"/>
+          <w:szCs w:val="24"/>
+          <w:lang w:eastAsia="es-CO"/>
+        </w:rPr>
+        <w:lastRenderedPageBreak/>
+        <w:t>Incluir en el cálculo de bonos, solo los pedidos que NO se encuentren marcados como Pedido Especial</w:t>
+      </w:r>
+    </w:p>
+    <w:p>
+      <w:pPr>
+        <w:numPr>
+          <w:ilvl w:val="0"/>
+          <w:numId w:val="126"/>
+        </w:numPr>
+        <w:contextualSpacing/>
+        <w:rPr>
+          <w:rFonts w:ascii="Arial" w:eastAsia="Times New Roman" w:hAnsi="Arial" w:cs="Arial"/>
+          <w:color w:val="000000" w:themeColor="text1"/>
+          <w:sz w:val="24"/>
+          <w:szCs w:val="24"/>
+          <w:lang w:eastAsia="es-CO"/>
+        </w:rPr>
+      </w:pPr>
+      <w:r>
+        <w:rPr>
+          <w:rFonts w:ascii="Arial" w:eastAsia="Times New Roman" w:hAnsi="Arial" w:cs="Arial"/>
+          <w:color w:val="000000" w:themeColor="text1"/>
+          <w:sz w:val="24"/>
+          <w:szCs w:val="24"/>
+          <w:lang w:eastAsia="es-CO"/>
+        </w:rPr>
+        <w:t>Creado el pedido la marca de Pedido especial no puede ser modificada con el pedido.</w:t>
+      </w:r>
+    </w:p>
+    <w:p>
+      <w:pPr>
+        <w:rPr>
+          <w:rFonts w:ascii="Arial" w:eastAsia="Times New Roman" w:hAnsi="Arial" w:cs="Arial"/>
+          <w:color w:val="000000" w:themeColor="text1"/>
+          <w:sz w:val="24"/>
+          <w:szCs w:val="24"/>
+          <w:lang w:eastAsia="es-CO"/>
+        </w:rPr>
+      </w:pPr>
+      <w:r>
+        <w:rPr>
+          <w:rFonts w:ascii="Arial" w:eastAsia="Times New Roman" w:hAnsi="Arial" w:cs="Arial"/>
+          <w:b/>
+          <w:color w:val="000000" w:themeColor="text1"/>
+          <w:sz w:val="24"/>
+          <w:szCs w:val="24"/>
+          <w:lang w:eastAsia="es-CO"/>
+        </w:rPr>
+        <w:t>Conceptos Clave</w:t>
+      </w:r>
+      <w:r>
+        <w:rPr>
+          <w:rFonts w:ascii="Arial" w:eastAsia="Times New Roman" w:hAnsi="Arial" w:cs="Arial"/>
+          <w:color w:val="000000" w:themeColor="text1"/>
+          <w:sz w:val="24"/>
+          <w:szCs w:val="24"/>
+          <w:lang w:eastAsia="es-CO"/>
+        </w:rPr>
+        <w:t>:</w:t>
+      </w:r>
+    </w:p>
+    <w:p>
+      <w:pPr>
+        <w:numPr>
+          <w:ilvl w:val="0"/>
+          <w:numId w:val="130"/>
+        </w:numPr>
+        <w:contextualSpacing/>
+        <w:rPr>
+          <w:rFonts w:ascii="Arial" w:eastAsia="Times New Roman" w:hAnsi="Arial" w:cs="Arial"/>
+          <w:color w:val="000000" w:themeColor="text1"/>
+          <w:sz w:val="24"/>
+          <w:szCs w:val="24"/>
+          <w:lang w:eastAsia="es-CO"/>
+        </w:rPr>
+      </w:pPr>
+      <w:r>
+        <w:rPr>
+          <w:rFonts w:ascii="Arial" w:eastAsia="Times New Roman" w:hAnsi="Arial" w:cs="Arial"/>
+          <w:b/>
+          <w:color w:val="000000" w:themeColor="text1"/>
+          <w:sz w:val="24"/>
+          <w:szCs w:val="24"/>
+          <w:lang w:eastAsia="es-CO"/>
+        </w:rPr>
+        <w:t>Pedido Especial</w:t>
+      </w:r>
+      <w:r>
+        <w:rPr>
+          <w:rFonts w:ascii="Arial" w:eastAsia="Times New Roman" w:hAnsi="Arial" w:cs="Arial"/>
+          <w:color w:val="000000" w:themeColor="text1"/>
+          <w:sz w:val="24"/>
+          <w:szCs w:val="24"/>
+          <w:lang w:eastAsia="es-CO"/>
+        </w:rPr>
+        <w:t>: Pedido de un Distribuidor que no se incluye dentro del cálculo de la Bonificación del periodo</w:t>
+      </w:r>
+    </w:p>
+    <w:p>
+      <w:pPr>
+        <w:rPr>
+          <w:rFonts w:ascii="Arial" w:eastAsia="Times New Roman" w:hAnsi="Arial" w:cs="Arial"/>
+          <w:color w:val="000000" w:themeColor="text1"/>
+          <w:sz w:val="24"/>
+          <w:szCs w:val="24"/>
+          <w:lang w:eastAsia="es-CO"/>
+        </w:rPr>
+      </w:pPr>
+      <w:r>
+        <w:rPr>
+          <w:rFonts w:ascii="Arial" w:eastAsia="Times New Roman" w:hAnsi="Arial" w:cs="Arial"/>
+          <w:b/>
+          <w:color w:val="000000" w:themeColor="text1"/>
+          <w:sz w:val="24"/>
+          <w:szCs w:val="24"/>
+          <w:lang w:eastAsia="es-CO"/>
+        </w:rPr>
+        <w:t>Restricciones</w:t>
+      </w:r>
+      <w:r>
+        <w:rPr>
+          <w:rFonts w:ascii="Arial" w:eastAsia="Times New Roman" w:hAnsi="Arial" w:cs="Arial"/>
+          <w:color w:val="000000" w:themeColor="text1"/>
+          <w:sz w:val="24"/>
+          <w:szCs w:val="24"/>
+          <w:lang w:eastAsia="es-CO"/>
+        </w:rPr>
+        <w:t>:</w:t>
+      </w:r>
+    </w:p>
+    <w:p>
+      <w:pPr>
+        <w:numPr>
+          <w:ilvl w:val="0"/>
+          <w:numId w:val="131"/>
+        </w:numPr>
+        <w:contextualSpacing/>
+        <w:rPr>
+          <w:rFonts w:ascii="Arial" w:eastAsia="Times New Roman" w:hAnsi="Arial" w:cs="Arial"/>
+          <w:color w:val="000000" w:themeColor="text1"/>
+          <w:sz w:val="24"/>
+          <w:szCs w:val="24"/>
+          <w:lang w:eastAsia="es-CO"/>
+        </w:rPr>
+      </w:pPr>
+      <w:r>
+        <w:rPr>
+          <w:rFonts w:ascii="Arial" w:eastAsia="Times New Roman" w:hAnsi="Arial" w:cs="Arial"/>
+          <w:color w:val="000000" w:themeColor="text1"/>
+          <w:sz w:val="24"/>
+          <w:szCs w:val="24"/>
+          <w:lang w:eastAsia="es-CO"/>
+        </w:rPr>
+        <w:t>SOLO UNA vigencia ACTIVA en un momento dado</w:t>
+      </w:r>
+    </w:p>
+    <w:p>
+      <w:pPr>
+        <w:numPr>
+          <w:ilvl w:val="0"/>
+          <w:numId w:val="131"/>
+        </w:numPr>
+        <w:contextualSpacing/>
+        <w:rPr>
+          <w:rFonts w:ascii="Arial" w:eastAsia="Times New Roman" w:hAnsi="Arial" w:cs="Arial"/>
+          <w:color w:val="000000" w:themeColor="text1"/>
+          <w:sz w:val="24"/>
+          <w:szCs w:val="24"/>
+          <w:lang w:eastAsia="es-CO"/>
+        </w:rPr>
+      </w:pPr>
+      <w:r>
+        <w:rPr>
+          <w:rFonts w:ascii="Arial" w:eastAsia="Times New Roman" w:hAnsi="Arial" w:cs="Arial"/>
+          <w:color w:val="000000" w:themeColor="text1"/>
+          <w:sz w:val="24"/>
+          <w:szCs w:val="24"/>
+          <w:lang w:eastAsia="es-CO"/>
+        </w:rPr>
+        <w:t>No se puede editar una vigencia que ya está en uso</w:t>
+      </w:r>
+    </w:p>
+    <w:p>
+      <w:pPr>
+        <w:numPr>
+          <w:ilvl w:val="0"/>
+          <w:numId w:val="131"/>
+        </w:numPr>
+        <w:contextualSpacing/>
+        <w:rPr>
+          <w:rFonts w:ascii="Arial" w:eastAsia="Times New Roman" w:hAnsi="Arial" w:cs="Arial"/>
+          <w:color w:val="000000" w:themeColor="text1"/>
+          <w:sz w:val="24"/>
+          <w:szCs w:val="24"/>
+          <w:lang w:eastAsia="es-CO"/>
+        </w:rPr>
+      </w:pPr>
+      <w:r>
+        <w:rPr>
+          <w:rFonts w:ascii="Arial" w:eastAsia="Times New Roman" w:hAnsi="Arial" w:cs="Arial"/>
+          <w:color w:val="000000" w:themeColor="text1"/>
+          <w:sz w:val="24"/>
+          <w:szCs w:val="24"/>
+          <w:lang w:eastAsia="es-CO"/>
+        </w:rPr>
+        <w:t>No se puede crear vigencia con fecha de activación en el pasado</w:t>
+      </w:r>
+    </w:p>
+    <w:p>
+      <w:pPr>
+        <w:rPr>
+          <w:rFonts w:ascii="Arial" w:eastAsia="Times New Roman" w:hAnsi="Arial" w:cs="Arial"/>
+          <w:color w:val="000000" w:themeColor="text1"/>
+          <w:sz w:val="24"/>
+          <w:szCs w:val="24"/>
+          <w:lang w:eastAsia="es-CO"/>
+        </w:rPr>
+      </w:pPr>
+      <w:r>
+        <w:rPr>
+          <w:rFonts w:ascii="Arial" w:eastAsia="Times New Roman" w:hAnsi="Arial" w:cs="Arial"/>
+          <w:color w:val="000000" w:themeColor="text1"/>
+          <w:sz w:val="24"/>
+          <w:szCs w:val="24"/>
+          <w:lang w:eastAsia="es-CO"/>
+        </w:rPr>
+        <w:t>Los rangos de una vigencia NO pueden traslaparse. Cada rango debe tener límites discretos sin sobre posición.</w:t>
+      </w:r>
+    </w:p>
+    <w:p>
+      <w:pPr>
+        <w:pStyle w:val="Ttulo3"/>
+      </w:pPr>
+      <w:r>
+        <w:t xml:space="preserve">2.2 </w:t>
+      </w:r>
+      <w:r>
+        <w:t>Módulo de Consulta de Bonificación (Distribuidor - Sitio Público)</w:t>
+      </w:r>
+    </w:p>
+    <w:p>
+      <w:pPr>
+        <w:rPr>
+          <w:rFonts w:ascii="Arial" w:eastAsia="Times New Roman" w:hAnsi="Arial" w:cs="Arial"/>
+          <w:color w:val="000000" w:themeColor="text1"/>
+          <w:sz w:val="24"/>
+          <w:szCs w:val="24"/>
+          <w:lang w:eastAsia="es-CO"/>
+        </w:rPr>
+      </w:pPr>
+      <w:r>
+        <w:rPr>
+          <w:rFonts w:ascii="Arial" w:eastAsia="Times New Roman" w:hAnsi="Arial" w:cs="Arial"/>
+          <w:color w:val="000000" w:themeColor="text1"/>
+          <w:sz w:val="24"/>
+          <w:szCs w:val="24"/>
+          <w:lang w:eastAsia="es-CO"/>
+        </w:rPr>
+        <w:t>Este módulo permite a los distribuidores acceder de forma segura a su información de bonificación sin necesidad de contactar a PROMOS.</w:t>
+      </w:r>
+    </w:p>
+    <w:p>
+      <w:pPr>
+        <w:pStyle w:val="Ttulo4"/>
+      </w:pPr>
+      <w:r>
+        <w:t xml:space="preserve">2.2.1 </w:t>
+      </w:r>
+      <w:r>
+        <w:t>Autenticación por OTP (</w:t>
+      </w:r>
+      <w:proofErr w:type="spellStart"/>
+      <w:r>
+        <w:t>One</w:t>
+      </w:r>
+      <w:proofErr w:type="spellEnd"/>
+      <w:r>
+        <w:t xml:space="preserve"> Time </w:t>
+      </w:r>
+      <w:proofErr w:type="spellStart"/>
+      <w:r>
+        <w:t>Password</w:t>
+      </w:r>
+      <w:proofErr w:type="spellEnd"/>
+      <w:r>
+        <w:t>)</w:t>
+      </w:r>
+    </w:p>
+    <w:p>
+      <w:pPr>
+        <w:rPr>
+          <w:rFonts w:ascii="Arial" w:eastAsia="Times New Roman" w:hAnsi="Arial" w:cs="Arial"/>
+          <w:color w:val="000000" w:themeColor="text1"/>
+          <w:sz w:val="24"/>
+          <w:szCs w:val="24"/>
+          <w:lang w:eastAsia="es-CO"/>
+        </w:rPr>
+      </w:pPr>
+      <w:r>
+        <w:rPr>
+          <w:rFonts w:ascii="Arial" w:eastAsia="Times New Roman" w:hAnsi="Arial" w:cs="Arial"/>
           <w:b/>
           <w:bCs/>
-          <w:sz w:val="27"/>
-          <w:szCs w:val="27"/>
-          <w:highlight w:val="yellow"/>
-          <w:lang w:eastAsia="es-CO"/>
-        </w:rPr>
-        <w:t xml:space="preserve"> </w:t>
-      </w:r>
-      <w:r>
-        <w:rPr>
-          <w:rFonts w:ascii="Times New Roman" w:eastAsia="Times New Roman" w:hAnsi="Times New Roman" w:cs="Times New Roman"/>
+          <w:color w:val="000000" w:themeColor="text1"/>
+          <w:sz w:val="24"/>
+          <w:szCs w:val="24"/>
+          <w:lang w:eastAsia="es-CO"/>
+        </w:rPr>
+        <w:t>Descripción:</w:t>
+      </w:r>
+      <w:r>
+        <w:rPr>
+          <w:rFonts w:ascii="Arial" w:eastAsia="Times New Roman" w:hAnsi="Arial" w:cs="Arial"/>
+          <w:color w:val="000000" w:themeColor="text1"/>
+          <w:sz w:val="24"/>
+          <w:szCs w:val="24"/>
+          <w:lang w:eastAsia="es-CO"/>
+        </w:rPr>
+        <w:br/>
+        <w:t>Proceso de autenticación seguro para que distribuidores accedan al sitio público desde la Página Promocional.</w:t>
+      </w:r>
+    </w:p>
+    <w:p>
+      <w:pPr>
+        <w:rPr>
+          <w:rFonts w:ascii="Arial" w:eastAsia="Times New Roman" w:hAnsi="Arial" w:cs="Arial"/>
+          <w:color w:val="000000" w:themeColor="text1"/>
+          <w:sz w:val="24"/>
+          <w:szCs w:val="24"/>
+          <w:lang w:eastAsia="es-CO"/>
+        </w:rPr>
+      </w:pPr>
+      <w:r>
+        <w:rPr>
+          <w:rFonts w:ascii="Arial" w:eastAsia="Times New Roman" w:hAnsi="Arial" w:cs="Arial"/>
           <w:b/>
           <w:bCs/>
-          <w:sz w:val="27"/>
-          <w:szCs w:val="27"/>
-          <w:highlight w:val="yellow"/>
-          <w:lang w:eastAsia="es-CO"/>
-        </w:rPr>
-        <w:t>Creación</w:t>
-      </w:r>
-      <w:r>
-        <w:rPr>
-          <w:rFonts w:ascii="Times New Roman" w:eastAsia="Times New Roman" w:hAnsi="Times New Roman" w:cs="Times New Roman"/>
+          <w:color w:val="000000" w:themeColor="text1"/>
+          <w:sz w:val="24"/>
+          <w:szCs w:val="24"/>
+          <w:lang w:eastAsia="es-CO"/>
+        </w:rPr>
+        <w:t>Flujo de Usuario:</w:t>
+      </w:r>
+    </w:p>
+    <w:p>
+      <w:pPr>
+        <w:pStyle w:val="Prrafodelista"/>
+        <w:numPr>
+          <w:ilvl w:val="0"/>
+          <w:numId w:val="15"/>
+        </w:numPr>
+        <w:rPr>
+          <w:rFonts w:ascii="Arial" w:eastAsia="Times New Roman" w:hAnsi="Arial" w:cs="Arial"/>
+          <w:color w:val="000000" w:themeColor="text1"/>
+          <w:sz w:val="24"/>
+          <w:szCs w:val="24"/>
+          <w:lang w:eastAsia="es-CO"/>
+        </w:rPr>
+      </w:pPr>
+      <w:r>
+        <w:rPr>
+          <w:rFonts w:ascii="Arial" w:eastAsia="Times New Roman" w:hAnsi="Arial" w:cs="Arial"/>
+          <w:color w:val="000000" w:themeColor="text1"/>
+          <w:sz w:val="24"/>
+          <w:szCs w:val="24"/>
+          <w:lang w:eastAsia="es-CO"/>
+        </w:rPr>
+        <w:t>Distribuidor hace clic en botón "Ver mi bonificación" en Página Promocional</w:t>
+      </w:r>
+    </w:p>
+    <w:p>
+      <w:pPr>
+        <w:pStyle w:val="Prrafodelista"/>
+        <w:numPr>
+          <w:ilvl w:val="0"/>
+          <w:numId w:val="15"/>
+        </w:numPr>
+        <w:rPr>
+          <w:rFonts w:ascii="Arial" w:eastAsia="Times New Roman" w:hAnsi="Arial" w:cs="Arial"/>
+          <w:color w:val="000000" w:themeColor="text1"/>
+          <w:sz w:val="24"/>
+          <w:szCs w:val="24"/>
+          <w:lang w:eastAsia="es-CO"/>
+        </w:rPr>
+      </w:pPr>
+      <w:r>
+        <w:rPr>
+          <w:rFonts w:ascii="Arial" w:eastAsia="Times New Roman" w:hAnsi="Arial" w:cs="Arial"/>
+          <w:color w:val="000000" w:themeColor="text1"/>
+          <w:sz w:val="24"/>
+          <w:szCs w:val="24"/>
+          <w:lang w:eastAsia="es-CO"/>
+        </w:rPr>
+        <w:t xml:space="preserve">Sistema </w:t>
+      </w:r>
+      <w:r>
+        <w:rPr>
+          <w:rFonts w:ascii="Arial" w:eastAsia="Times New Roman" w:hAnsi="Arial" w:cs="Arial"/>
+          <w:color w:val="000000" w:themeColor="text1"/>
+          <w:sz w:val="24"/>
+          <w:szCs w:val="24"/>
+          <w:lang w:eastAsia="es-CO"/>
+        </w:rPr>
+        <w:t>re</w:t>
+      </w:r>
+      <w:r>
+        <w:rPr>
+          <w:rFonts w:ascii="Arial" w:eastAsia="Times New Roman" w:hAnsi="Arial" w:cs="Arial"/>
+          <w:color w:val="000000" w:themeColor="text1"/>
+          <w:sz w:val="24"/>
+          <w:szCs w:val="24"/>
+          <w:lang w:eastAsia="es-CO"/>
+        </w:rPr>
+        <w:t>-</w:t>
+      </w:r>
+      <w:r>
+        <w:rPr>
+          <w:rFonts w:ascii="Arial" w:eastAsia="Times New Roman" w:hAnsi="Arial" w:cs="Arial"/>
+          <w:color w:val="000000" w:themeColor="text1"/>
+          <w:sz w:val="24"/>
+          <w:szCs w:val="24"/>
+          <w:lang w:eastAsia="es-CO"/>
+        </w:rPr>
+        <w:t>direcciona</w:t>
+      </w:r>
+      <w:r>
+        <w:rPr>
+          <w:rFonts w:ascii="Arial" w:eastAsia="Times New Roman" w:hAnsi="Arial" w:cs="Arial"/>
+          <w:color w:val="000000" w:themeColor="text1"/>
+          <w:sz w:val="24"/>
+          <w:szCs w:val="24"/>
+          <w:lang w:eastAsia="es-CO"/>
+        </w:rPr>
+        <w:t xml:space="preserve"> a Sitio Público </w:t>
+      </w:r>
+      <w:r>
+        <w:rPr>
+          <w:rFonts w:ascii="Arial" w:eastAsia="Times New Roman" w:hAnsi="Arial" w:cs="Arial"/>
+          <w:color w:val="000000" w:themeColor="text1"/>
+          <w:sz w:val="24"/>
+          <w:szCs w:val="24"/>
+          <w:lang w:eastAsia="es-CO"/>
+        </w:rPr>
+        <w:t>Aldebarán</w:t>
+      </w:r>
+    </w:p>
+    <w:p>
+      <w:pPr>
+        <w:pStyle w:val="Prrafodelista"/>
+        <w:numPr>
+          <w:ilvl w:val="0"/>
+          <w:numId w:val="15"/>
+        </w:numPr>
+        <w:rPr>
+          <w:rFonts w:ascii="Arial" w:eastAsia="Times New Roman" w:hAnsi="Arial" w:cs="Arial"/>
+          <w:color w:val="000000" w:themeColor="text1"/>
+          <w:sz w:val="24"/>
+          <w:szCs w:val="24"/>
+          <w:lang w:eastAsia="es-CO"/>
+        </w:rPr>
+      </w:pPr>
+      <w:r>
+        <w:rPr>
+          <w:rFonts w:ascii="Arial" w:eastAsia="Times New Roman" w:hAnsi="Arial" w:cs="Arial"/>
+          <w:color w:val="000000" w:themeColor="text1"/>
+          <w:sz w:val="24"/>
+          <w:szCs w:val="24"/>
+          <w:lang w:eastAsia="es-CO"/>
+        </w:rPr>
+        <w:t>Distribuidor ingresa su número de documento (cédula)</w:t>
+      </w:r>
+    </w:p>
+    <w:p>
+      <w:pPr>
+        <w:pStyle w:val="Prrafodelista"/>
+        <w:numPr>
+          <w:ilvl w:val="0"/>
+          <w:numId w:val="15"/>
+        </w:numPr>
+        <w:rPr>
+          <w:rFonts w:ascii="Arial" w:eastAsia="Times New Roman" w:hAnsi="Arial" w:cs="Arial"/>
+          <w:color w:val="000000" w:themeColor="text1"/>
+          <w:sz w:val="24"/>
+          <w:szCs w:val="24"/>
+          <w:lang w:eastAsia="es-CO"/>
+        </w:rPr>
+      </w:pPr>
+      <w:r>
+        <w:rPr>
+          <w:rFonts w:ascii="Arial" w:eastAsia="Times New Roman" w:hAnsi="Arial" w:cs="Arial"/>
+          <w:color w:val="000000" w:themeColor="text1"/>
+          <w:sz w:val="24"/>
+          <w:szCs w:val="24"/>
+          <w:lang w:eastAsia="es-CO"/>
+        </w:rPr>
+        <w:t>Sistema valida que:</w:t>
+      </w:r>
+    </w:p>
+    <w:p>
+      <w:pPr>
+        <w:pStyle w:val="Prrafodelista"/>
+        <w:numPr>
+          <w:ilvl w:val="1"/>
+          <w:numId w:val="16"/>
+        </w:numPr>
+        <w:ind w:left="993"/>
+        <w:rPr>
+          <w:rFonts w:ascii="Arial" w:eastAsia="Times New Roman" w:hAnsi="Arial" w:cs="Arial"/>
+          <w:color w:val="000000" w:themeColor="text1"/>
+          <w:sz w:val="24"/>
+          <w:szCs w:val="24"/>
+          <w:lang w:eastAsia="es-CO"/>
+        </w:rPr>
+      </w:pPr>
+      <w:r>
+        <w:rPr>
+          <w:rFonts w:ascii="Arial" w:eastAsia="Times New Roman" w:hAnsi="Arial" w:cs="Arial"/>
+          <w:color w:val="000000" w:themeColor="text1"/>
+          <w:sz w:val="24"/>
+          <w:szCs w:val="24"/>
+          <w:lang w:eastAsia="es-CO"/>
+        </w:rPr>
+        <w:t xml:space="preserve">El documento existe en </w:t>
+      </w:r>
+      <w:r>
+        <w:rPr>
+          <w:rFonts w:ascii="Arial" w:eastAsia="Times New Roman" w:hAnsi="Arial" w:cs="Arial"/>
+          <w:color w:val="000000" w:themeColor="text1"/>
+          <w:sz w:val="24"/>
+          <w:szCs w:val="24"/>
+          <w:lang w:eastAsia="es-CO"/>
+        </w:rPr>
+        <w:t>Aldebarán</w:t>
+      </w:r>
+    </w:p>
+    <w:p>
+      <w:pPr>
+        <w:pStyle w:val="Prrafodelista"/>
+        <w:numPr>
+          <w:ilvl w:val="1"/>
+          <w:numId w:val="16"/>
+        </w:numPr>
+        <w:ind w:left="993"/>
+        <w:rPr>
+          <w:rFonts w:ascii="Arial" w:eastAsia="Times New Roman" w:hAnsi="Arial" w:cs="Arial"/>
+          <w:color w:val="000000" w:themeColor="text1"/>
+          <w:sz w:val="24"/>
+          <w:szCs w:val="24"/>
+          <w:lang w:eastAsia="es-CO"/>
+        </w:rPr>
+      </w:pPr>
+      <w:r>
+        <w:rPr>
+          <w:rFonts w:ascii="Arial" w:eastAsia="Times New Roman" w:hAnsi="Arial" w:cs="Arial"/>
+          <w:color w:val="000000" w:themeColor="text1"/>
+          <w:sz w:val="24"/>
+          <w:szCs w:val="24"/>
+          <w:lang w:eastAsia="es-CO"/>
+        </w:rPr>
+        <w:t>Es tipo "</w:t>
+      </w:r>
+      <w:r>
+        <w:rPr>
+          <w:rFonts w:ascii="Arial" w:eastAsia="Times New Roman" w:hAnsi="Arial" w:cs="Arial"/>
+          <w:b/>
+          <w:color w:val="000000" w:themeColor="text1"/>
+          <w:sz w:val="24"/>
+          <w:szCs w:val="24"/>
+          <w:lang w:eastAsia="es-CO"/>
+        </w:rPr>
+        <w:t>DISTRIBUIDOR</w:t>
+      </w:r>
+      <w:r>
+        <w:rPr>
+          <w:rFonts w:ascii="Arial" w:eastAsia="Times New Roman" w:hAnsi="Arial" w:cs="Arial"/>
+          <w:color w:val="000000" w:themeColor="text1"/>
+          <w:sz w:val="24"/>
+          <w:szCs w:val="24"/>
+          <w:lang w:eastAsia="es-CO"/>
+        </w:rPr>
+        <w:t>" (no otro tipo de cliente)</w:t>
+      </w:r>
+    </w:p>
+    <w:p>
+      <w:pPr>
+        <w:pStyle w:val="Prrafodelista"/>
+        <w:numPr>
+          <w:ilvl w:val="1"/>
+          <w:numId w:val="16"/>
+        </w:numPr>
+        <w:ind w:left="993"/>
+        <w:rPr>
+          <w:rFonts w:ascii="Arial" w:eastAsia="Times New Roman" w:hAnsi="Arial" w:cs="Arial"/>
+          <w:color w:val="000000" w:themeColor="text1"/>
+          <w:sz w:val="24"/>
+          <w:szCs w:val="24"/>
+          <w:lang w:eastAsia="es-CO"/>
+        </w:rPr>
+      </w:pPr>
+      <w:r>
+        <w:rPr>
+          <w:rFonts w:ascii="Arial" w:eastAsia="Times New Roman" w:hAnsi="Arial" w:cs="Arial"/>
+          <w:color w:val="000000" w:themeColor="text1"/>
+          <w:sz w:val="24"/>
+          <w:szCs w:val="24"/>
+          <w:lang w:eastAsia="es-CO"/>
+        </w:rPr>
+        <w:t xml:space="preserve">Tiene Email </w:t>
+      </w:r>
+      <w:r>
+        <w:rPr>
+          <w:rFonts w:ascii="Arial" w:eastAsia="Times New Roman" w:hAnsi="Arial" w:cs="Arial"/>
+          <w:color w:val="000000" w:themeColor="text1"/>
+          <w:sz w:val="24"/>
+          <w:szCs w:val="24"/>
+          <w:lang w:eastAsia="es-CO"/>
+        </w:rPr>
+        <w:t xml:space="preserve">para Bonificaciones </w:t>
+      </w:r>
+    </w:p>
+    <w:p>
+      <w:pPr>
+        <w:pStyle w:val="Prrafodelista"/>
+        <w:numPr>
+          <w:ilvl w:val="0"/>
+          <w:numId w:val="15"/>
+        </w:numPr>
+        <w:rPr>
+          <w:rFonts w:ascii="Arial" w:eastAsia="Times New Roman" w:hAnsi="Arial" w:cs="Arial"/>
+          <w:color w:val="000000" w:themeColor="text1"/>
+          <w:sz w:val="24"/>
+          <w:szCs w:val="24"/>
+          <w:lang w:eastAsia="es-CO"/>
+        </w:rPr>
+      </w:pPr>
+      <w:r>
+        <w:rPr>
+          <w:rFonts w:ascii="Arial" w:eastAsia="Times New Roman" w:hAnsi="Arial" w:cs="Arial"/>
+          <w:color w:val="000000" w:themeColor="text1"/>
+          <w:sz w:val="24"/>
+          <w:szCs w:val="24"/>
+          <w:lang w:eastAsia="es-CO"/>
+        </w:rPr>
+        <w:t>Sistema genera código OTP de 6 dígitos</w:t>
+      </w:r>
+    </w:p>
+    <w:p>
+      <w:pPr>
+        <w:pStyle w:val="Prrafodelista"/>
+        <w:numPr>
+          <w:ilvl w:val="0"/>
+          <w:numId w:val="15"/>
+        </w:numPr>
+        <w:rPr>
+          <w:rFonts w:ascii="Arial" w:eastAsia="Times New Roman" w:hAnsi="Arial" w:cs="Arial"/>
+          <w:color w:val="000000" w:themeColor="text1"/>
+          <w:sz w:val="24"/>
+          <w:szCs w:val="24"/>
+          <w:lang w:eastAsia="es-CO"/>
+        </w:rPr>
+      </w:pPr>
+      <w:r>
+        <w:rPr>
+          <w:rFonts w:ascii="Arial" w:eastAsia="Times New Roman" w:hAnsi="Arial" w:cs="Arial"/>
+          <w:color w:val="000000" w:themeColor="text1"/>
+          <w:sz w:val="24"/>
+          <w:szCs w:val="24"/>
+          <w:lang w:eastAsia="es-CO"/>
+        </w:rPr>
+        <w:t xml:space="preserve">Sistema envía OTP por Email </w:t>
+      </w:r>
+      <w:r>
+        <w:rPr>
+          <w:rFonts w:ascii="Arial" w:eastAsia="Times New Roman" w:hAnsi="Arial" w:cs="Arial"/>
+          <w:color w:val="000000" w:themeColor="text1"/>
+          <w:sz w:val="24"/>
+          <w:szCs w:val="24"/>
+          <w:lang w:eastAsia="es-CO"/>
+        </w:rPr>
+        <w:t>al</w:t>
+      </w:r>
+      <w:r>
+        <w:rPr>
+          <w:rFonts w:ascii="Arial" w:eastAsia="Times New Roman" w:hAnsi="Arial" w:cs="Arial"/>
+          <w:color w:val="000000" w:themeColor="text1"/>
+          <w:sz w:val="24"/>
+          <w:szCs w:val="24"/>
+          <w:lang w:eastAsia="es-CO"/>
+        </w:rPr>
+        <w:t xml:space="preserve"> distribuidor</w:t>
+      </w:r>
+    </w:p>
+    <w:p>
+      <w:pPr>
+        <w:pStyle w:val="Prrafodelista"/>
+        <w:numPr>
+          <w:ilvl w:val="0"/>
+          <w:numId w:val="15"/>
+        </w:numPr>
+        <w:rPr>
+          <w:rFonts w:ascii="Arial" w:eastAsia="Times New Roman" w:hAnsi="Arial" w:cs="Arial"/>
+          <w:color w:val="000000" w:themeColor="text1"/>
+          <w:sz w:val="24"/>
+          <w:szCs w:val="24"/>
+          <w:lang w:eastAsia="es-CO"/>
+        </w:rPr>
+      </w:pPr>
+      <w:r>
+        <w:rPr>
+          <w:rFonts w:ascii="Arial" w:eastAsia="Times New Roman" w:hAnsi="Arial" w:cs="Arial"/>
+          <w:color w:val="000000" w:themeColor="text1"/>
+          <w:sz w:val="24"/>
+          <w:szCs w:val="24"/>
+          <w:lang w:eastAsia="es-CO"/>
+        </w:rPr>
+        <w:t>Distribuidor ingresa código OTP recibido</w:t>
+      </w:r>
+    </w:p>
+    <w:p>
+      <w:pPr>
+        <w:pStyle w:val="Prrafodelista"/>
+        <w:numPr>
+          <w:ilvl w:val="0"/>
+          <w:numId w:val="15"/>
+        </w:numPr>
+        <w:rPr>
+          <w:rFonts w:ascii="Arial" w:eastAsia="Times New Roman" w:hAnsi="Arial" w:cs="Arial"/>
+          <w:color w:val="000000" w:themeColor="text1"/>
+          <w:sz w:val="24"/>
+          <w:szCs w:val="24"/>
+          <w:lang w:eastAsia="es-CO"/>
+        </w:rPr>
+      </w:pPr>
+      <w:r>
+        <w:rPr>
+          <w:rFonts w:ascii="Arial" w:eastAsia="Times New Roman" w:hAnsi="Arial" w:cs="Arial"/>
+          <w:color w:val="000000" w:themeColor="text1"/>
+          <w:sz w:val="24"/>
+          <w:szCs w:val="24"/>
+          <w:lang w:eastAsia="es-CO"/>
+        </w:rPr>
+        <w:t>Sistema valida OTP (</w:t>
+      </w:r>
+      <w:r>
+        <w:rPr>
+          <w:rFonts w:ascii="Arial" w:eastAsia="Times New Roman" w:hAnsi="Arial" w:cs="Arial"/>
+          <w:color w:val="000000" w:themeColor="text1"/>
+          <w:sz w:val="24"/>
+          <w:szCs w:val="24"/>
+          <w:lang w:eastAsia="es-CO"/>
+        </w:rPr>
+        <w:t>Numero de intentos máximo configurable</w:t>
+      </w:r>
+      <w:r>
+        <w:rPr>
+          <w:rFonts w:ascii="Arial" w:eastAsia="Times New Roman" w:hAnsi="Arial" w:cs="Arial"/>
+          <w:color w:val="000000" w:themeColor="text1"/>
+          <w:sz w:val="24"/>
+          <w:szCs w:val="24"/>
+          <w:lang w:eastAsia="es-CO"/>
+        </w:rPr>
+        <w:t>)</w:t>
+      </w:r>
+    </w:p>
+    <w:p>
+      <w:pPr>
+        <w:pStyle w:val="Prrafodelista"/>
+        <w:numPr>
+          <w:ilvl w:val="0"/>
+          <w:numId w:val="15"/>
+        </w:numPr>
+        <w:rPr>
+          <w:rFonts w:ascii="Arial" w:eastAsia="Times New Roman" w:hAnsi="Arial" w:cs="Arial"/>
+          <w:color w:val="000000" w:themeColor="text1"/>
+          <w:sz w:val="24"/>
+          <w:szCs w:val="24"/>
+          <w:lang w:eastAsia="es-CO"/>
+        </w:rPr>
+      </w:pPr>
+      <w:r>
+        <w:rPr>
+          <w:rFonts w:ascii="Arial" w:eastAsia="Times New Roman" w:hAnsi="Arial" w:cs="Arial"/>
+          <w:color w:val="000000" w:themeColor="text1"/>
+          <w:sz w:val="24"/>
+          <w:szCs w:val="24"/>
+          <w:lang w:eastAsia="es-CO"/>
+        </w:rPr>
+        <w:t xml:space="preserve">Si es válido, sistema crea sesión JWT válida por </w:t>
+      </w:r>
+      <w:r>
+        <w:rPr>
+          <w:rFonts w:ascii="Arial" w:eastAsia="Times New Roman" w:hAnsi="Arial" w:cs="Arial"/>
+          <w:color w:val="000000" w:themeColor="text1"/>
+          <w:sz w:val="24"/>
+          <w:szCs w:val="24"/>
+          <w:lang w:eastAsia="es-CO"/>
+        </w:rPr>
+        <w:t xml:space="preserve">número de </w:t>
+      </w:r>
+      <w:r>
+        <w:rPr>
+          <w:rFonts w:ascii="Arial" w:eastAsia="Times New Roman" w:hAnsi="Arial" w:cs="Arial"/>
+          <w:color w:val="000000" w:themeColor="text1"/>
+          <w:sz w:val="24"/>
+          <w:szCs w:val="24"/>
+          <w:lang w:eastAsia="es-CO"/>
+        </w:rPr>
+        <w:t>horas</w:t>
+      </w:r>
+      <w:r>
+        <w:rPr>
+          <w:rFonts w:ascii="Arial" w:eastAsia="Times New Roman" w:hAnsi="Arial" w:cs="Arial"/>
+          <w:color w:val="000000" w:themeColor="text1"/>
+          <w:sz w:val="24"/>
+          <w:szCs w:val="24"/>
+          <w:lang w:eastAsia="es-CO"/>
+        </w:rPr>
+        <w:t xml:space="preserve"> configurable.</w:t>
+      </w:r>
+    </w:p>
+    <w:p>
+      <w:pPr>
+        <w:pStyle w:val="Prrafodelista"/>
+        <w:numPr>
+          <w:ilvl w:val="0"/>
+          <w:numId w:val="15"/>
+        </w:numPr>
+        <w:rPr>
+          <w:rFonts w:ascii="Arial" w:eastAsia="Times New Roman" w:hAnsi="Arial" w:cs="Arial"/>
+          <w:color w:val="000000" w:themeColor="text1"/>
+          <w:sz w:val="24"/>
+          <w:szCs w:val="24"/>
+          <w:lang w:eastAsia="es-CO"/>
+        </w:rPr>
+      </w:pPr>
+      <w:r>
+        <w:rPr>
+          <w:rFonts w:ascii="Arial" w:eastAsia="Times New Roman" w:hAnsi="Arial" w:cs="Arial"/>
+          <w:color w:val="000000" w:themeColor="text1"/>
+          <w:sz w:val="24"/>
+          <w:szCs w:val="24"/>
+          <w:lang w:eastAsia="es-CO"/>
+        </w:rPr>
+        <w:t>Distribuidor accede a su información de bonificación</w:t>
+      </w:r>
+    </w:p>
+    <w:p>
+      <w:pPr>
+        <w:rPr>
+          <w:rFonts w:ascii="Arial" w:eastAsia="Times New Roman" w:hAnsi="Arial" w:cs="Arial"/>
           <w:b/>
           <w:bCs/>
-          <w:sz w:val="27"/>
-          <w:szCs w:val="27"/>
-          <w:highlight w:val="yellow"/>
-          <w:lang w:eastAsia="es-CO"/>
-        </w:rPr>
-        <w:t xml:space="preserve"> de </w:t>
-      </w:r>
-      <w:r>
-        <w:rPr>
-          <w:rFonts w:ascii="Times New Roman" w:eastAsia="Times New Roman" w:hAnsi="Times New Roman" w:cs="Times New Roman"/>
+          <w:color w:val="000000" w:themeColor="text1"/>
+          <w:sz w:val="24"/>
+          <w:szCs w:val="24"/>
+          <w:lang w:eastAsia="es-CO"/>
+        </w:rPr>
+      </w:pPr>
+    </w:p>
+    <w:p>
+      <w:pPr>
+        <w:rPr>
+          <w:rFonts w:ascii="Arial" w:eastAsia="Times New Roman" w:hAnsi="Arial" w:cs="Arial"/>
+          <w:color w:val="000000" w:themeColor="text1"/>
+          <w:sz w:val="24"/>
+          <w:szCs w:val="24"/>
+          <w:lang w:eastAsia="es-CO"/>
+        </w:rPr>
+      </w:pPr>
+      <w:r>
+        <w:rPr>
+          <w:rFonts w:ascii="Arial" w:eastAsia="Times New Roman" w:hAnsi="Arial" w:cs="Arial"/>
           <w:b/>
           <w:bCs/>
-          <w:sz w:val="27"/>
-          <w:szCs w:val="27"/>
-          <w:highlight w:val="yellow"/>
-          <w:lang w:eastAsia="es-CO"/>
-        </w:rPr>
-        <w:t>Pedidos Especiales</w:t>
-      </w:r>
-    </w:p>
-    <w:p>
-      <w:pPr>
-        <w:rPr>
-          <w:rFonts w:ascii="Arial" w:eastAsia="Times New Roman" w:hAnsi="Arial" w:cs="Arial"/>
-          <w:color w:val="000000" w:themeColor="text1"/>
-          <w:sz w:val="24"/>
-          <w:szCs w:val="24"/>
-          <w:lang w:eastAsia="es-CO"/>
-        </w:rPr>
-      </w:pPr>
-      <w:r>
-        <w:rPr>
-          <w:rFonts w:ascii="Arial" w:eastAsia="Times New Roman" w:hAnsi="Arial" w:cs="Arial"/>
-          <w:b/>
-          <w:color w:val="000000" w:themeColor="text1"/>
-          <w:sz w:val="24"/>
-          <w:szCs w:val="24"/>
-          <w:lang w:eastAsia="es-CO"/>
-        </w:rPr>
-        <w:t>Descripción</w:t>
-      </w:r>
-      <w:r>
-        <w:rPr>
-          <w:rFonts w:ascii="Arial" w:eastAsia="Times New Roman" w:hAnsi="Arial" w:cs="Arial"/>
-          <w:color w:val="000000" w:themeColor="text1"/>
-          <w:sz w:val="24"/>
-          <w:szCs w:val="24"/>
-          <w:lang w:eastAsia="es-CO"/>
-        </w:rPr>
-        <w:t>:</w:t>
-      </w:r>
-    </w:p>
-    <w:p>
-      <w:pPr>
-        <w:rPr>
-          <w:rFonts w:ascii="Arial" w:eastAsia="Times New Roman" w:hAnsi="Arial" w:cs="Arial"/>
-          <w:color w:val="000000" w:themeColor="text1"/>
-          <w:sz w:val="24"/>
-          <w:szCs w:val="24"/>
-          <w:lang w:eastAsia="es-CO"/>
-        </w:rPr>
-      </w:pPr>
-      <w:r>
-        <w:rPr>
-          <w:rFonts w:ascii="Arial" w:eastAsia="Times New Roman" w:hAnsi="Arial" w:cs="Arial"/>
-          <w:color w:val="000000" w:themeColor="text1"/>
-          <w:sz w:val="24"/>
-          <w:szCs w:val="24"/>
-          <w:lang w:eastAsia="es-CO"/>
-        </w:rPr>
-        <w:t>Identificar que pedidos deben ser excluidos o incluidos en el cálculo de bonificación para un distribuidor</w:t>
-      </w:r>
-    </w:p>
-    <w:p>
-      <w:pPr>
-        <w:rPr>
-          <w:rFonts w:ascii="Arial" w:eastAsia="Times New Roman" w:hAnsi="Arial" w:cs="Arial"/>
-          <w:color w:val="000000" w:themeColor="text1"/>
-          <w:sz w:val="24"/>
-          <w:szCs w:val="24"/>
-          <w:lang w:eastAsia="es-CO"/>
-        </w:rPr>
-      </w:pPr>
-      <w:r>
-        <w:rPr>
-          <w:rFonts w:ascii="Arial" w:eastAsia="Times New Roman" w:hAnsi="Arial" w:cs="Arial"/>
-          <w:b/>
-          <w:color w:val="000000" w:themeColor="text1"/>
-          <w:sz w:val="24"/>
-          <w:szCs w:val="24"/>
-          <w:lang w:eastAsia="es-CO"/>
-        </w:rPr>
-        <w:t>Funcionalidades</w:t>
-      </w:r>
-      <w:r>
-        <w:rPr>
-          <w:rFonts w:ascii="Arial" w:eastAsia="Times New Roman" w:hAnsi="Arial" w:cs="Arial"/>
-          <w:color w:val="000000" w:themeColor="text1"/>
-          <w:sz w:val="24"/>
-          <w:szCs w:val="24"/>
-          <w:lang w:eastAsia="es-CO"/>
-        </w:rPr>
-        <w:t>:</w:t>
-      </w:r>
-    </w:p>
-    <w:p>
-      <w:pPr>
-        <w:numPr>
-          <w:ilvl w:val="0"/>
-          <w:numId w:val="126"/>
-        </w:numPr>
-        <w:contextualSpacing/>
-        <w:rPr>
-          <w:rFonts w:ascii="Arial" w:eastAsia="Times New Roman" w:hAnsi="Arial" w:cs="Arial"/>
-          <w:color w:val="000000" w:themeColor="text1"/>
-          <w:sz w:val="24"/>
-          <w:szCs w:val="24"/>
-          <w:lang w:eastAsia="es-CO"/>
-        </w:rPr>
-      </w:pPr>
-      <w:r>
-        <w:rPr>
-          <w:rFonts w:ascii="Arial" w:eastAsia="Times New Roman" w:hAnsi="Arial" w:cs="Arial"/>
-          <w:color w:val="000000" w:themeColor="text1"/>
-          <w:sz w:val="24"/>
-          <w:szCs w:val="24"/>
-          <w:lang w:eastAsia="es-CO"/>
-        </w:rPr>
-        <w:t>Marcar pedidos especial</w:t>
-      </w:r>
-    </w:p>
-    <w:p>
-      <w:pPr>
-        <w:numPr>
-          <w:ilvl w:val="0"/>
-          <w:numId w:val="126"/>
-        </w:numPr>
-        <w:contextualSpacing/>
-        <w:rPr>
-          <w:rFonts w:ascii="Arial" w:eastAsia="Times New Roman" w:hAnsi="Arial" w:cs="Arial"/>
-          <w:color w:val="000000" w:themeColor="text1"/>
-          <w:sz w:val="24"/>
-          <w:szCs w:val="24"/>
-          <w:lang w:eastAsia="es-CO"/>
-        </w:rPr>
-      </w:pPr>
-      <w:r>
-        <w:rPr>
-          <w:rFonts w:ascii="Arial" w:eastAsia="Times New Roman" w:hAnsi="Arial" w:cs="Arial"/>
-          <w:color w:val="000000" w:themeColor="text1"/>
-          <w:sz w:val="24"/>
-          <w:szCs w:val="24"/>
-          <w:lang w:eastAsia="es-CO"/>
-        </w:rPr>
-        <w:t>Quitar marca de pedido especial</w:t>
-      </w:r>
-    </w:p>
-    <w:p>
-      <w:pPr>
-        <w:numPr>
-          <w:ilvl w:val="0"/>
-          <w:numId w:val="126"/>
-        </w:numPr>
-        <w:contextualSpacing/>
-        <w:rPr>
-          <w:rFonts w:ascii="Arial" w:eastAsia="Times New Roman" w:hAnsi="Arial" w:cs="Arial"/>
-          <w:color w:val="000000" w:themeColor="text1"/>
-          <w:sz w:val="24"/>
-          <w:szCs w:val="24"/>
-          <w:lang w:eastAsia="es-CO"/>
-        </w:rPr>
-      </w:pPr>
-      <w:r>
-        <w:rPr>
-          <w:rFonts w:ascii="Arial" w:eastAsia="Times New Roman" w:hAnsi="Arial" w:cs="Arial"/>
           <w:color w:val="000000" w:themeColor="text1"/>
           <w:sz w:val="24"/>
           <w:szCs w:val="24"/>
           <w:lang w:eastAsia="es-CO"/>
         </w:rPr>
         <w:lastRenderedPageBreak/>
-        <w:t>Incluir en el cálculo de bonos, solo los pedidos que NO se encuentren marcados como Pedido Especial</w:t>
-      </w:r>
-    </w:p>
-    <w:p>
-      <w:pPr>
-        <w:numPr>
-          <w:ilvl w:val="0"/>
-          <w:numId w:val="126"/>
-        </w:numPr>
-        <w:contextualSpacing/>
-        <w:rPr>
-          <w:rFonts w:ascii="Arial" w:eastAsia="Times New Roman" w:hAnsi="Arial" w:cs="Arial"/>
-          <w:color w:val="000000" w:themeColor="text1"/>
-          <w:sz w:val="24"/>
-          <w:szCs w:val="24"/>
-          <w:lang w:eastAsia="es-CO"/>
-        </w:rPr>
-      </w:pPr>
-      <w:r>
-        <w:rPr>
-          <w:rFonts w:ascii="Arial" w:eastAsia="Times New Roman" w:hAnsi="Arial" w:cs="Arial"/>
-          <w:color w:val="000000" w:themeColor="text1"/>
-          <w:sz w:val="24"/>
-          <w:szCs w:val="24"/>
-          <w:lang w:eastAsia="es-CO"/>
-        </w:rPr>
-        <w:t>Creado el pedido la marca de Pedido especial no puede ser modificada con el pedido.</w:t>
-      </w:r>
-    </w:p>
-    <w:p>
-      <w:pPr>
-        <w:rPr>
-          <w:rFonts w:ascii="Arial" w:eastAsia="Times New Roman" w:hAnsi="Arial" w:cs="Arial"/>
-          <w:color w:val="000000" w:themeColor="text1"/>
-          <w:sz w:val="24"/>
-          <w:szCs w:val="24"/>
-          <w:lang w:eastAsia="es-CO"/>
-        </w:rPr>
-      </w:pPr>
-      <w:r>
-        <w:rPr>
-          <w:rFonts w:ascii="Arial" w:eastAsia="Times New Roman" w:hAnsi="Arial" w:cs="Arial"/>
-          <w:b/>
-          <w:color w:val="000000" w:themeColor="text1"/>
-          <w:sz w:val="24"/>
-          <w:szCs w:val="24"/>
-          <w:lang w:eastAsia="es-CO"/>
-        </w:rPr>
-        <w:t>Conceptos Clave</w:t>
-      </w:r>
-      <w:r>
-        <w:rPr>
-          <w:rFonts w:ascii="Arial" w:eastAsia="Times New Roman" w:hAnsi="Arial" w:cs="Arial"/>
-          <w:color w:val="000000" w:themeColor="text1"/>
-          <w:sz w:val="24"/>
-          <w:szCs w:val="24"/>
-          <w:lang w:eastAsia="es-CO"/>
-        </w:rPr>
-        <w:t>:</w:t>
-      </w:r>
-    </w:p>
-    <w:p>
-      <w:pPr>
-        <w:numPr>
-          <w:ilvl w:val="0"/>
-          <w:numId w:val="130"/>
-        </w:numPr>
-        <w:contextualSpacing/>
-        <w:rPr>
-          <w:rFonts w:ascii="Arial" w:eastAsia="Times New Roman" w:hAnsi="Arial" w:cs="Arial"/>
-          <w:color w:val="000000" w:themeColor="text1"/>
-          <w:sz w:val="24"/>
-          <w:szCs w:val="24"/>
-          <w:lang w:eastAsia="es-CO"/>
-        </w:rPr>
-      </w:pPr>
-      <w:r>
-        <w:rPr>
-          <w:rFonts w:ascii="Arial" w:eastAsia="Times New Roman" w:hAnsi="Arial" w:cs="Arial"/>
-          <w:b/>
-          <w:color w:val="000000" w:themeColor="text1"/>
-          <w:sz w:val="24"/>
-          <w:szCs w:val="24"/>
-          <w:lang w:eastAsia="es-CO"/>
-        </w:rPr>
-        <w:t>Pedido Especial</w:t>
-      </w:r>
-      <w:r>
-        <w:rPr>
-          <w:rFonts w:ascii="Arial" w:eastAsia="Times New Roman" w:hAnsi="Arial" w:cs="Arial"/>
-          <w:color w:val="000000" w:themeColor="text1"/>
-          <w:sz w:val="24"/>
-          <w:szCs w:val="24"/>
-          <w:lang w:eastAsia="es-CO"/>
-        </w:rPr>
-        <w:t xml:space="preserve">: </w:t>
-      </w:r>
-      <w:r>
-        <w:rPr>
-          <w:rFonts w:ascii="Arial" w:eastAsia="Times New Roman" w:hAnsi="Arial" w:cs="Arial"/>
-          <w:color w:val="000000" w:themeColor="text1"/>
-          <w:sz w:val="24"/>
-          <w:szCs w:val="24"/>
-          <w:lang w:eastAsia="es-CO"/>
-        </w:rPr>
-        <w:t>Pedido de un Distribuidor que no se incluye dentro del cálculo de la Bonificación del periodo</w:t>
-      </w:r>
-    </w:p>
-    <w:p>
-      <w:pPr>
-        <w:rPr>
-          <w:rFonts w:ascii="Arial" w:eastAsia="Times New Roman" w:hAnsi="Arial" w:cs="Arial"/>
-          <w:color w:val="000000" w:themeColor="text1"/>
-          <w:sz w:val="24"/>
-          <w:szCs w:val="24"/>
-          <w:lang w:eastAsia="es-CO"/>
-        </w:rPr>
-      </w:pPr>
-      <w:r>
-        <w:rPr>
-          <w:rFonts w:ascii="Arial" w:eastAsia="Times New Roman" w:hAnsi="Arial" w:cs="Arial"/>
-          <w:b/>
-          <w:color w:val="000000" w:themeColor="text1"/>
-          <w:sz w:val="24"/>
-          <w:szCs w:val="24"/>
-          <w:lang w:eastAsia="es-CO"/>
-        </w:rPr>
-        <w:t>Restricciones</w:t>
-      </w:r>
-      <w:r>
-        <w:rPr>
-          <w:rFonts w:ascii="Arial" w:eastAsia="Times New Roman" w:hAnsi="Arial" w:cs="Arial"/>
-          <w:color w:val="000000" w:themeColor="text1"/>
-          <w:sz w:val="24"/>
-          <w:szCs w:val="24"/>
-          <w:lang w:eastAsia="es-CO"/>
-        </w:rPr>
-        <w:t>:</w:t>
-      </w:r>
-    </w:p>
-    <w:p>
-      <w:pPr>
-        <w:numPr>
-          <w:ilvl w:val="0"/>
-          <w:numId w:val="131"/>
-        </w:numPr>
-        <w:contextualSpacing/>
-        <w:rPr>
-          <w:rFonts w:ascii="Arial" w:eastAsia="Times New Roman" w:hAnsi="Arial" w:cs="Arial"/>
-          <w:color w:val="000000" w:themeColor="text1"/>
-          <w:sz w:val="24"/>
-          <w:szCs w:val="24"/>
-          <w:lang w:eastAsia="es-CO"/>
-        </w:rPr>
-      </w:pPr>
-      <w:r>
-        <w:rPr>
-          <w:rFonts w:ascii="Arial" w:eastAsia="Times New Roman" w:hAnsi="Arial" w:cs="Arial"/>
-          <w:color w:val="000000" w:themeColor="text1"/>
-          <w:sz w:val="24"/>
-          <w:szCs w:val="24"/>
-          <w:lang w:eastAsia="es-CO"/>
-        </w:rPr>
-        <w:t>SOLO UNA vigencia ACTIVA en un momento dado</w:t>
-      </w:r>
-    </w:p>
-    <w:p>
-      <w:pPr>
-        <w:numPr>
-          <w:ilvl w:val="0"/>
-          <w:numId w:val="131"/>
-        </w:numPr>
-        <w:contextualSpacing/>
-        <w:rPr>
-          <w:rFonts w:ascii="Arial" w:eastAsia="Times New Roman" w:hAnsi="Arial" w:cs="Arial"/>
-          <w:color w:val="000000" w:themeColor="text1"/>
-          <w:sz w:val="24"/>
-          <w:szCs w:val="24"/>
-          <w:lang w:eastAsia="es-CO"/>
-        </w:rPr>
-      </w:pPr>
-      <w:r>
-        <w:rPr>
-          <w:rFonts w:ascii="Arial" w:eastAsia="Times New Roman" w:hAnsi="Arial" w:cs="Arial"/>
-          <w:color w:val="000000" w:themeColor="text1"/>
-          <w:sz w:val="24"/>
-          <w:szCs w:val="24"/>
-          <w:lang w:eastAsia="es-CO"/>
-        </w:rPr>
-        <w:t>No se puede editar una vigencia que ya está en uso</w:t>
-      </w:r>
-    </w:p>
-    <w:p>
-      <w:pPr>
-        <w:numPr>
-          <w:ilvl w:val="0"/>
-          <w:numId w:val="131"/>
-        </w:numPr>
-        <w:contextualSpacing/>
-        <w:rPr>
-          <w:rFonts w:ascii="Arial" w:eastAsia="Times New Roman" w:hAnsi="Arial" w:cs="Arial"/>
-          <w:color w:val="000000" w:themeColor="text1"/>
-          <w:sz w:val="24"/>
-          <w:szCs w:val="24"/>
-          <w:lang w:eastAsia="es-CO"/>
-        </w:rPr>
-      </w:pPr>
-      <w:r>
-        <w:rPr>
-          <w:rFonts w:ascii="Arial" w:eastAsia="Times New Roman" w:hAnsi="Arial" w:cs="Arial"/>
-          <w:color w:val="000000" w:themeColor="text1"/>
-          <w:sz w:val="24"/>
-          <w:szCs w:val="24"/>
-          <w:lang w:eastAsia="es-CO"/>
-        </w:rPr>
-        <w:t>No se puede crear vigencia con fecha de activación en el pasado</w:t>
-      </w:r>
-    </w:p>
-    <w:p>
-      <w:pPr>
-        <w:rPr>
-          <w:rFonts w:ascii="Arial" w:eastAsia="Times New Roman" w:hAnsi="Arial" w:cs="Arial"/>
-          <w:color w:val="000000" w:themeColor="text1"/>
-          <w:sz w:val="24"/>
-          <w:szCs w:val="24"/>
-          <w:lang w:eastAsia="es-CO"/>
-        </w:rPr>
-      </w:pPr>
-      <w:r>
-        <w:rPr>
-          <w:rFonts w:ascii="Arial" w:eastAsia="Times New Roman" w:hAnsi="Arial" w:cs="Arial"/>
-          <w:color w:val="000000" w:themeColor="text1"/>
-          <w:sz w:val="24"/>
-          <w:szCs w:val="24"/>
-          <w:lang w:eastAsia="es-CO"/>
-        </w:rPr>
-        <w:t>Los rangos de una vigencia NO pueden traslaparse. Cada rango debe tener límites discretos sin sobre posición.</w:t>
-      </w:r>
-    </w:p>
-    <w:p>
-      <w:pPr>
-        <w:rPr>
-          <w:rFonts w:ascii="Arial" w:eastAsia="Times New Roman" w:hAnsi="Arial" w:cs="Arial"/>
-          <w:color w:val="000000" w:themeColor="text1"/>
-          <w:sz w:val="24"/>
-          <w:szCs w:val="24"/>
-          <w:lang w:eastAsia="es-CO"/>
-        </w:rPr>
-      </w:pPr>
-    </w:p>
-    <w:p>
-      <w:pPr>
-        <w:rPr>
-          <w:rFonts w:ascii="Arial" w:eastAsia="Times New Roman" w:hAnsi="Arial" w:cs="Arial"/>
-          <w:color w:val="000000" w:themeColor="text1"/>
-          <w:sz w:val="24"/>
-          <w:szCs w:val="24"/>
-          <w:lang w:eastAsia="es-CO"/>
-        </w:rPr>
-      </w:pPr>
-    </w:p>
-    <w:p>
-      <w:pPr>
-        <w:pStyle w:val="Ttulo3"/>
-      </w:pPr>
-      <w:r>
-        <w:t xml:space="preserve">2.2 Módulo de Consulta de </w:t>
-      </w:r>
-      <w:r>
-        <w:t>Bonificación</w:t>
-      </w:r>
-      <w:r>
-        <w:t xml:space="preserve"> (Distribuidor - Sitio Público)</w:t>
-      </w:r>
-    </w:p>
-    <w:p>
-      <w:pPr>
-        <w:rPr>
-          <w:rFonts w:ascii="Arial" w:eastAsia="Times New Roman" w:hAnsi="Arial" w:cs="Arial"/>
-          <w:color w:val="000000" w:themeColor="text1"/>
-          <w:sz w:val="24"/>
-          <w:szCs w:val="24"/>
-          <w:lang w:eastAsia="es-CO"/>
-        </w:rPr>
-      </w:pPr>
-      <w:r>
-        <w:rPr>
-          <w:rFonts w:ascii="Arial" w:eastAsia="Times New Roman" w:hAnsi="Arial" w:cs="Arial"/>
-          <w:color w:val="000000" w:themeColor="text1"/>
-          <w:sz w:val="24"/>
-          <w:szCs w:val="24"/>
-          <w:lang w:eastAsia="es-CO"/>
-        </w:rPr>
-        <w:t>Este módulo permite a los distribuidores acceder de forma segura a su información de bonificación sin necesidad de contactar a PROMOS.</w:t>
-      </w:r>
-    </w:p>
-    <w:p>
-      <w:pPr>
-        <w:pStyle w:val="Ttulo4"/>
-      </w:pPr>
-      <w:r>
-        <w:t xml:space="preserve">2.2.1 </w:t>
-      </w:r>
-      <w:r>
-        <w:rPr>
-          <w:highlight w:val="yellow"/>
-        </w:rPr>
-        <w:t>Autenticación por OTP (</w:t>
-      </w:r>
-      <w:proofErr w:type="spellStart"/>
-      <w:r>
-        <w:rPr>
-          <w:highlight w:val="yellow"/>
-        </w:rPr>
-        <w:t>One</w:t>
-      </w:r>
-      <w:proofErr w:type="spellEnd"/>
-      <w:r>
-        <w:rPr>
-          <w:highlight w:val="yellow"/>
-        </w:rPr>
-        <w:t xml:space="preserve"> Time </w:t>
-      </w:r>
-      <w:proofErr w:type="spellStart"/>
-      <w:r>
-        <w:rPr>
-          <w:highlight w:val="yellow"/>
-        </w:rPr>
-        <w:t>Password</w:t>
-      </w:r>
-      <w:proofErr w:type="spellEnd"/>
-      <w:r>
-        <w:rPr>
-          <w:highlight w:val="yellow"/>
-        </w:rPr>
-        <w:t>)</w:t>
-      </w:r>
-    </w:p>
-    <w:p>
-      <w:pPr>
-        <w:rPr>
-          <w:rFonts w:ascii="Arial" w:eastAsia="Times New Roman" w:hAnsi="Arial" w:cs="Arial"/>
-          <w:color w:val="000000" w:themeColor="text1"/>
-          <w:sz w:val="24"/>
-          <w:szCs w:val="24"/>
-          <w:lang w:eastAsia="es-CO"/>
-        </w:rPr>
-      </w:pPr>
-      <w:r>
-        <w:rPr>
-          <w:rFonts w:ascii="Arial" w:eastAsia="Times New Roman" w:hAnsi="Arial" w:cs="Arial"/>
-          <w:b/>
-          <w:bCs/>
-          <w:color w:val="000000" w:themeColor="text1"/>
-          <w:sz w:val="24"/>
-          <w:szCs w:val="24"/>
-          <w:lang w:eastAsia="es-CO"/>
-        </w:rPr>
-        <w:t>Descripción:</w:t>
-      </w:r>
-      <w:r>
-        <w:rPr>
-          <w:rFonts w:ascii="Arial" w:eastAsia="Times New Roman" w:hAnsi="Arial" w:cs="Arial"/>
-          <w:color w:val="000000" w:themeColor="text1"/>
-          <w:sz w:val="24"/>
-          <w:szCs w:val="24"/>
-          <w:lang w:eastAsia="es-CO"/>
-        </w:rPr>
-        <w:br/>
-        <w:t>Proceso de autenticación seguro para que distribuidores accedan al sitio público desde la Página Promocional.</w:t>
-      </w:r>
-    </w:p>
-    <w:p>
-      <w:pPr>
-        <w:rPr>
-          <w:rFonts w:ascii="Arial" w:eastAsia="Times New Roman" w:hAnsi="Arial" w:cs="Arial"/>
-          <w:color w:val="000000" w:themeColor="text1"/>
-          <w:sz w:val="24"/>
-          <w:szCs w:val="24"/>
-          <w:lang w:eastAsia="es-CO"/>
-        </w:rPr>
-      </w:pPr>
-      <w:r>
-        <w:rPr>
-          <w:rFonts w:ascii="Arial" w:eastAsia="Times New Roman" w:hAnsi="Arial" w:cs="Arial"/>
-          <w:b/>
-          <w:bCs/>
-          <w:color w:val="000000" w:themeColor="text1"/>
-          <w:sz w:val="24"/>
-          <w:szCs w:val="24"/>
-          <w:lang w:eastAsia="es-CO"/>
-        </w:rPr>
-        <w:t>Flujo de Usuario:</w:t>
-      </w:r>
-    </w:p>
-    <w:p>
-      <w:pPr>
-        <w:pStyle w:val="Prrafodelista"/>
-        <w:numPr>
-          <w:ilvl w:val="0"/>
-          <w:numId w:val="15"/>
-        </w:numPr>
-        <w:rPr>
-          <w:rFonts w:ascii="Arial" w:eastAsia="Times New Roman" w:hAnsi="Arial" w:cs="Arial"/>
-          <w:color w:val="000000" w:themeColor="text1"/>
-          <w:sz w:val="24"/>
-          <w:szCs w:val="24"/>
-          <w:lang w:eastAsia="es-CO"/>
-        </w:rPr>
-      </w:pPr>
-      <w:r>
-        <w:rPr>
-          <w:rFonts w:ascii="Arial" w:eastAsia="Times New Roman" w:hAnsi="Arial" w:cs="Arial"/>
-          <w:color w:val="000000" w:themeColor="text1"/>
-          <w:sz w:val="24"/>
-          <w:szCs w:val="24"/>
-          <w:lang w:eastAsia="es-CO"/>
-        </w:rPr>
-        <w:t>Distribuidor hace clic en botón "Ver mi bonificación" en Página Promocional</w:t>
-      </w:r>
-    </w:p>
-    <w:p>
-      <w:pPr>
-        <w:pStyle w:val="Prrafodelista"/>
-        <w:numPr>
-          <w:ilvl w:val="0"/>
-          <w:numId w:val="15"/>
-        </w:numPr>
-        <w:rPr>
-          <w:rFonts w:ascii="Arial" w:eastAsia="Times New Roman" w:hAnsi="Arial" w:cs="Arial"/>
-          <w:color w:val="000000" w:themeColor="text1"/>
-          <w:sz w:val="24"/>
-          <w:szCs w:val="24"/>
-          <w:lang w:eastAsia="es-CO"/>
-        </w:rPr>
-      </w:pPr>
-      <w:r>
-        <w:rPr>
-          <w:rFonts w:ascii="Arial" w:eastAsia="Times New Roman" w:hAnsi="Arial" w:cs="Arial"/>
-          <w:color w:val="000000" w:themeColor="text1"/>
-          <w:sz w:val="24"/>
-          <w:szCs w:val="24"/>
-          <w:lang w:eastAsia="es-CO"/>
-        </w:rPr>
-        <w:t xml:space="preserve">Sistema </w:t>
-      </w:r>
-      <w:r>
-        <w:rPr>
-          <w:rFonts w:ascii="Arial" w:eastAsia="Times New Roman" w:hAnsi="Arial" w:cs="Arial"/>
-          <w:color w:val="000000" w:themeColor="text1"/>
-          <w:sz w:val="24"/>
-          <w:szCs w:val="24"/>
-          <w:lang w:eastAsia="es-CO"/>
-        </w:rPr>
-        <w:t>re</w:t>
-      </w:r>
-      <w:r>
-        <w:rPr>
-          <w:rFonts w:ascii="Arial" w:eastAsia="Times New Roman" w:hAnsi="Arial" w:cs="Arial"/>
-          <w:color w:val="000000" w:themeColor="text1"/>
-          <w:sz w:val="24"/>
-          <w:szCs w:val="24"/>
-          <w:lang w:eastAsia="es-CO"/>
-        </w:rPr>
-        <w:t>-</w:t>
-      </w:r>
-      <w:r>
-        <w:rPr>
-          <w:rFonts w:ascii="Arial" w:eastAsia="Times New Roman" w:hAnsi="Arial" w:cs="Arial"/>
-          <w:color w:val="000000" w:themeColor="text1"/>
-          <w:sz w:val="24"/>
-          <w:szCs w:val="24"/>
-          <w:lang w:eastAsia="es-CO"/>
-        </w:rPr>
-        <w:t>direcciona</w:t>
-      </w:r>
-      <w:r>
-        <w:rPr>
-          <w:rFonts w:ascii="Arial" w:eastAsia="Times New Roman" w:hAnsi="Arial" w:cs="Arial"/>
-          <w:color w:val="000000" w:themeColor="text1"/>
-          <w:sz w:val="24"/>
-          <w:szCs w:val="24"/>
-          <w:lang w:eastAsia="es-CO"/>
-        </w:rPr>
-        <w:t xml:space="preserve"> a Sitio Público </w:t>
-      </w:r>
-      <w:r>
-        <w:rPr>
-          <w:rFonts w:ascii="Arial" w:eastAsia="Times New Roman" w:hAnsi="Arial" w:cs="Arial"/>
-          <w:color w:val="000000" w:themeColor="text1"/>
-          <w:sz w:val="24"/>
-          <w:szCs w:val="24"/>
-          <w:lang w:eastAsia="es-CO"/>
-        </w:rPr>
-        <w:t>Aldebarán</w:t>
-      </w:r>
-    </w:p>
-    <w:p>
-      <w:pPr>
-        <w:pStyle w:val="Prrafodelista"/>
-        <w:numPr>
-          <w:ilvl w:val="0"/>
-          <w:numId w:val="15"/>
-        </w:numPr>
-        <w:rPr>
-          <w:rFonts w:ascii="Arial" w:eastAsia="Times New Roman" w:hAnsi="Arial" w:cs="Arial"/>
-          <w:color w:val="000000" w:themeColor="text1"/>
-          <w:sz w:val="24"/>
-          <w:szCs w:val="24"/>
-          <w:lang w:eastAsia="es-CO"/>
-        </w:rPr>
-      </w:pPr>
-      <w:r>
-        <w:rPr>
-          <w:rFonts w:ascii="Arial" w:eastAsia="Times New Roman" w:hAnsi="Arial" w:cs="Arial"/>
-          <w:color w:val="000000" w:themeColor="text1"/>
-          <w:sz w:val="24"/>
-          <w:szCs w:val="24"/>
-          <w:lang w:eastAsia="es-CO"/>
-        </w:rPr>
-        <w:t>Distribuidor ingresa su número de documento (cédula)</w:t>
-      </w:r>
-    </w:p>
-    <w:p>
-      <w:pPr>
-        <w:pStyle w:val="Prrafodelista"/>
-        <w:numPr>
-          <w:ilvl w:val="0"/>
-          <w:numId w:val="15"/>
-        </w:numPr>
-        <w:rPr>
-          <w:rFonts w:ascii="Arial" w:eastAsia="Times New Roman" w:hAnsi="Arial" w:cs="Arial"/>
-          <w:color w:val="000000" w:themeColor="text1"/>
-          <w:sz w:val="24"/>
-          <w:szCs w:val="24"/>
-          <w:lang w:eastAsia="es-CO"/>
-        </w:rPr>
-      </w:pPr>
-      <w:r>
-        <w:rPr>
-          <w:rFonts w:ascii="Arial" w:eastAsia="Times New Roman" w:hAnsi="Arial" w:cs="Arial"/>
-          <w:color w:val="000000" w:themeColor="text1"/>
-          <w:sz w:val="24"/>
-          <w:szCs w:val="24"/>
-          <w:lang w:eastAsia="es-CO"/>
-        </w:rPr>
-        <w:t>Sistema valida que:</w:t>
-      </w:r>
-    </w:p>
-    <w:p>
-      <w:pPr>
-        <w:pStyle w:val="Prrafodelista"/>
-        <w:numPr>
-          <w:ilvl w:val="1"/>
-          <w:numId w:val="16"/>
-        </w:numPr>
-        <w:ind w:left="993"/>
-        <w:rPr>
-          <w:rFonts w:ascii="Arial" w:eastAsia="Times New Roman" w:hAnsi="Arial" w:cs="Arial"/>
-          <w:color w:val="000000" w:themeColor="text1"/>
-          <w:sz w:val="24"/>
-          <w:szCs w:val="24"/>
-          <w:lang w:eastAsia="es-CO"/>
-        </w:rPr>
-      </w:pPr>
-      <w:r>
-        <w:rPr>
-          <w:rFonts w:ascii="Arial" w:eastAsia="Times New Roman" w:hAnsi="Arial" w:cs="Arial"/>
-          <w:color w:val="000000" w:themeColor="text1"/>
-          <w:sz w:val="24"/>
-          <w:szCs w:val="24"/>
-          <w:lang w:eastAsia="es-CO"/>
-        </w:rPr>
-        <w:t xml:space="preserve">El documento existe en </w:t>
-      </w:r>
-      <w:r>
-        <w:rPr>
-          <w:rFonts w:ascii="Arial" w:eastAsia="Times New Roman" w:hAnsi="Arial" w:cs="Arial"/>
-          <w:color w:val="000000" w:themeColor="text1"/>
-          <w:sz w:val="24"/>
-          <w:szCs w:val="24"/>
-          <w:lang w:eastAsia="es-CO"/>
-        </w:rPr>
-        <w:t>Aldebarán</w:t>
-      </w:r>
-    </w:p>
-    <w:p>
-      <w:pPr>
-        <w:pStyle w:val="Prrafodelista"/>
-        <w:numPr>
-          <w:ilvl w:val="1"/>
-          <w:numId w:val="16"/>
-        </w:numPr>
-        <w:ind w:left="993"/>
-        <w:rPr>
-          <w:rFonts w:ascii="Arial" w:eastAsia="Times New Roman" w:hAnsi="Arial" w:cs="Arial"/>
-          <w:color w:val="000000" w:themeColor="text1"/>
-          <w:sz w:val="24"/>
-          <w:szCs w:val="24"/>
-          <w:lang w:eastAsia="es-CO"/>
-        </w:rPr>
-      </w:pPr>
-      <w:r>
-        <w:rPr>
-          <w:rFonts w:ascii="Arial" w:eastAsia="Times New Roman" w:hAnsi="Arial" w:cs="Arial"/>
-          <w:color w:val="000000" w:themeColor="text1"/>
-          <w:sz w:val="24"/>
-          <w:szCs w:val="24"/>
-          <w:lang w:eastAsia="es-CO"/>
-        </w:rPr>
-        <w:t>Es tipo "</w:t>
-      </w:r>
-      <w:r>
-        <w:rPr>
-          <w:rFonts w:ascii="Arial" w:eastAsia="Times New Roman" w:hAnsi="Arial" w:cs="Arial"/>
-          <w:b/>
-          <w:color w:val="000000" w:themeColor="text1"/>
-          <w:sz w:val="24"/>
-          <w:szCs w:val="24"/>
-          <w:lang w:eastAsia="es-CO"/>
-        </w:rPr>
-        <w:t>DISTRIBUIDOR</w:t>
-      </w:r>
-      <w:r>
-        <w:rPr>
-          <w:rFonts w:ascii="Arial" w:eastAsia="Times New Roman" w:hAnsi="Arial" w:cs="Arial"/>
-          <w:color w:val="000000" w:themeColor="text1"/>
-          <w:sz w:val="24"/>
-          <w:szCs w:val="24"/>
-          <w:lang w:eastAsia="es-CO"/>
-        </w:rPr>
-        <w:t>" (no otro tipo de cliente)</w:t>
-      </w:r>
-    </w:p>
-    <w:p>
-      <w:pPr>
-        <w:pStyle w:val="Prrafodelista"/>
-        <w:numPr>
-          <w:ilvl w:val="1"/>
-          <w:numId w:val="16"/>
-        </w:numPr>
-        <w:ind w:left="993"/>
-        <w:rPr>
-          <w:rFonts w:ascii="Arial" w:eastAsia="Times New Roman" w:hAnsi="Arial" w:cs="Arial"/>
-          <w:color w:val="000000" w:themeColor="text1"/>
-          <w:sz w:val="24"/>
-          <w:szCs w:val="24"/>
-          <w:lang w:eastAsia="es-CO"/>
-        </w:rPr>
-      </w:pPr>
-      <w:r>
-        <w:rPr>
-          <w:rFonts w:ascii="Arial" w:eastAsia="Times New Roman" w:hAnsi="Arial" w:cs="Arial"/>
-          <w:color w:val="000000" w:themeColor="text1"/>
-          <w:sz w:val="24"/>
-          <w:szCs w:val="24"/>
-          <w:lang w:eastAsia="es-CO"/>
-        </w:rPr>
-        <w:t xml:space="preserve">Tiene Email </w:t>
-      </w:r>
-      <w:r>
-        <w:rPr>
-          <w:rFonts w:ascii="Arial" w:eastAsia="Times New Roman" w:hAnsi="Arial" w:cs="Arial"/>
-          <w:color w:val="000000" w:themeColor="text1"/>
-          <w:sz w:val="24"/>
-          <w:szCs w:val="24"/>
-          <w:lang w:eastAsia="es-CO"/>
-        </w:rPr>
-        <w:t xml:space="preserve">para Bonificaciones </w:t>
-      </w:r>
-    </w:p>
-    <w:p>
-      <w:pPr>
-        <w:pStyle w:val="Prrafodelista"/>
-        <w:numPr>
-          <w:ilvl w:val="0"/>
-          <w:numId w:val="15"/>
-        </w:numPr>
-        <w:rPr>
-          <w:rFonts w:ascii="Arial" w:eastAsia="Times New Roman" w:hAnsi="Arial" w:cs="Arial"/>
-          <w:color w:val="000000" w:themeColor="text1"/>
-          <w:sz w:val="24"/>
-          <w:szCs w:val="24"/>
-          <w:lang w:eastAsia="es-CO"/>
-        </w:rPr>
-      </w:pPr>
-      <w:r>
-        <w:rPr>
-          <w:rFonts w:ascii="Arial" w:eastAsia="Times New Roman" w:hAnsi="Arial" w:cs="Arial"/>
-          <w:color w:val="000000" w:themeColor="text1"/>
-          <w:sz w:val="24"/>
-          <w:szCs w:val="24"/>
-          <w:lang w:eastAsia="es-CO"/>
-        </w:rPr>
-        <w:t>Sistema genera código OTP de 6 dígitos</w:t>
-      </w:r>
-    </w:p>
-    <w:p>
-      <w:pPr>
-        <w:pStyle w:val="Prrafodelista"/>
-        <w:numPr>
-          <w:ilvl w:val="0"/>
-          <w:numId w:val="15"/>
-        </w:numPr>
-        <w:rPr>
-          <w:rFonts w:ascii="Arial" w:eastAsia="Times New Roman" w:hAnsi="Arial" w:cs="Arial"/>
-          <w:color w:val="000000" w:themeColor="text1"/>
-          <w:sz w:val="24"/>
-          <w:szCs w:val="24"/>
-          <w:lang w:eastAsia="es-CO"/>
-        </w:rPr>
-      </w:pPr>
-      <w:r>
-        <w:rPr>
-          <w:rFonts w:ascii="Arial" w:eastAsia="Times New Roman" w:hAnsi="Arial" w:cs="Arial"/>
-          <w:color w:val="000000" w:themeColor="text1"/>
-          <w:sz w:val="24"/>
-          <w:szCs w:val="24"/>
-          <w:lang w:eastAsia="es-CO"/>
-        </w:rPr>
-        <w:t xml:space="preserve">Sistema envía OTP por Email </w:t>
-      </w:r>
-      <w:r>
-        <w:rPr>
-          <w:rFonts w:ascii="Arial" w:eastAsia="Times New Roman" w:hAnsi="Arial" w:cs="Arial"/>
-          <w:color w:val="000000" w:themeColor="text1"/>
-          <w:sz w:val="24"/>
-          <w:szCs w:val="24"/>
-          <w:lang w:eastAsia="es-CO"/>
-        </w:rPr>
-        <w:t>al</w:t>
-      </w:r>
-      <w:r>
-        <w:rPr>
-          <w:rFonts w:ascii="Arial" w:eastAsia="Times New Roman" w:hAnsi="Arial" w:cs="Arial"/>
-          <w:color w:val="000000" w:themeColor="text1"/>
-          <w:sz w:val="24"/>
-          <w:szCs w:val="24"/>
-          <w:lang w:eastAsia="es-CO"/>
-        </w:rPr>
-        <w:t xml:space="preserve"> distribuidor</w:t>
-      </w:r>
-    </w:p>
-    <w:p>
-      <w:pPr>
-        <w:pStyle w:val="Prrafodelista"/>
-        <w:numPr>
-          <w:ilvl w:val="0"/>
-          <w:numId w:val="15"/>
-        </w:numPr>
-        <w:rPr>
-          <w:rFonts w:ascii="Arial" w:eastAsia="Times New Roman" w:hAnsi="Arial" w:cs="Arial"/>
-          <w:color w:val="000000" w:themeColor="text1"/>
-          <w:sz w:val="24"/>
-          <w:szCs w:val="24"/>
-          <w:lang w:eastAsia="es-CO"/>
-        </w:rPr>
-      </w:pPr>
-      <w:r>
-        <w:rPr>
-          <w:rFonts w:ascii="Arial" w:eastAsia="Times New Roman" w:hAnsi="Arial" w:cs="Arial"/>
-          <w:color w:val="000000" w:themeColor="text1"/>
-          <w:sz w:val="24"/>
-          <w:szCs w:val="24"/>
-          <w:lang w:eastAsia="es-CO"/>
-        </w:rPr>
-        <w:t>Distribuidor ingresa código OTP recibido</w:t>
-      </w:r>
-    </w:p>
-    <w:p>
-      <w:pPr>
-        <w:pStyle w:val="Prrafodelista"/>
-        <w:numPr>
-          <w:ilvl w:val="0"/>
-          <w:numId w:val="15"/>
-        </w:numPr>
-        <w:rPr>
-          <w:rFonts w:ascii="Arial" w:eastAsia="Times New Roman" w:hAnsi="Arial" w:cs="Arial"/>
-          <w:color w:val="000000" w:themeColor="text1"/>
-          <w:sz w:val="24"/>
-          <w:szCs w:val="24"/>
-          <w:lang w:eastAsia="es-CO"/>
-        </w:rPr>
-      </w:pPr>
-      <w:r>
-        <w:rPr>
-          <w:rFonts w:ascii="Arial" w:eastAsia="Times New Roman" w:hAnsi="Arial" w:cs="Arial"/>
-          <w:color w:val="000000" w:themeColor="text1"/>
-          <w:sz w:val="24"/>
-          <w:szCs w:val="24"/>
-          <w:lang w:eastAsia="es-CO"/>
-        </w:rPr>
-        <w:t>Sistema valida OTP (</w:t>
-      </w:r>
-      <w:r>
-        <w:rPr>
-          <w:rFonts w:ascii="Arial" w:eastAsia="Times New Roman" w:hAnsi="Arial" w:cs="Arial"/>
-          <w:color w:val="000000" w:themeColor="text1"/>
-          <w:sz w:val="24"/>
-          <w:szCs w:val="24"/>
-          <w:lang w:eastAsia="es-CO"/>
-        </w:rPr>
-        <w:t>Numero de intentos máximo configurable</w:t>
-      </w:r>
-      <w:r>
-        <w:rPr>
-          <w:rFonts w:ascii="Arial" w:eastAsia="Times New Roman" w:hAnsi="Arial" w:cs="Arial"/>
-          <w:color w:val="000000" w:themeColor="text1"/>
-          <w:sz w:val="24"/>
-          <w:szCs w:val="24"/>
-          <w:lang w:eastAsia="es-CO"/>
-        </w:rPr>
-        <w:t>)</w:t>
-      </w:r>
-    </w:p>
-    <w:p>
-      <w:pPr>
-        <w:pStyle w:val="Prrafodelista"/>
-        <w:numPr>
-          <w:ilvl w:val="0"/>
-          <w:numId w:val="15"/>
-        </w:numPr>
-        <w:rPr>
-          <w:rFonts w:ascii="Arial" w:eastAsia="Times New Roman" w:hAnsi="Arial" w:cs="Arial"/>
-          <w:color w:val="000000" w:themeColor="text1"/>
-          <w:sz w:val="24"/>
-          <w:szCs w:val="24"/>
-          <w:lang w:eastAsia="es-CO"/>
-        </w:rPr>
-      </w:pPr>
-      <w:r>
-        <w:rPr>
-          <w:rFonts w:ascii="Arial" w:eastAsia="Times New Roman" w:hAnsi="Arial" w:cs="Arial"/>
-          <w:color w:val="000000" w:themeColor="text1"/>
-          <w:sz w:val="24"/>
-          <w:szCs w:val="24"/>
-          <w:lang w:eastAsia="es-CO"/>
-        </w:rPr>
-        <w:t xml:space="preserve">Si es válido, sistema crea sesión JWT válida por </w:t>
-      </w:r>
-      <w:r>
-        <w:rPr>
-          <w:rFonts w:ascii="Arial" w:eastAsia="Times New Roman" w:hAnsi="Arial" w:cs="Arial"/>
-          <w:color w:val="000000" w:themeColor="text1"/>
-          <w:sz w:val="24"/>
-          <w:szCs w:val="24"/>
-          <w:lang w:eastAsia="es-CO"/>
-        </w:rPr>
-        <w:t xml:space="preserve">número de </w:t>
-      </w:r>
-      <w:r>
-        <w:rPr>
-          <w:rFonts w:ascii="Arial" w:eastAsia="Times New Roman" w:hAnsi="Arial" w:cs="Arial"/>
-          <w:color w:val="000000" w:themeColor="text1"/>
-          <w:sz w:val="24"/>
-          <w:szCs w:val="24"/>
-          <w:lang w:eastAsia="es-CO"/>
-        </w:rPr>
-        <w:t>horas</w:t>
-      </w:r>
-      <w:r>
-        <w:rPr>
-          <w:rFonts w:ascii="Arial" w:eastAsia="Times New Roman" w:hAnsi="Arial" w:cs="Arial"/>
-          <w:color w:val="000000" w:themeColor="text1"/>
-          <w:sz w:val="24"/>
-          <w:szCs w:val="24"/>
-          <w:lang w:eastAsia="es-CO"/>
-        </w:rPr>
-        <w:t xml:space="preserve"> configurable.</w:t>
-      </w:r>
-    </w:p>
-    <w:p>
-      <w:pPr>
-        <w:pStyle w:val="Prrafodelista"/>
-        <w:numPr>
-          <w:ilvl w:val="0"/>
-          <w:numId w:val="15"/>
-        </w:numPr>
-        <w:rPr>
-          <w:rFonts w:ascii="Arial" w:eastAsia="Times New Roman" w:hAnsi="Arial" w:cs="Arial"/>
-          <w:color w:val="000000" w:themeColor="text1"/>
-          <w:sz w:val="24"/>
-          <w:szCs w:val="24"/>
-          <w:lang w:eastAsia="es-CO"/>
-        </w:rPr>
-      </w:pPr>
-      <w:r>
-        <w:rPr>
-          <w:rFonts w:ascii="Arial" w:eastAsia="Times New Roman" w:hAnsi="Arial" w:cs="Arial"/>
-          <w:color w:val="000000" w:themeColor="text1"/>
-          <w:sz w:val="24"/>
-          <w:szCs w:val="24"/>
-          <w:lang w:eastAsia="es-CO"/>
-        </w:rPr>
-        <w:lastRenderedPageBreak/>
-        <w:t>Distribuidor accede a su información de bonificación</w:t>
-      </w:r>
-    </w:p>
-    <w:p>
-      <w:pPr>
-        <w:rPr>
-          <w:rFonts w:ascii="Arial" w:eastAsia="Times New Roman" w:hAnsi="Arial" w:cs="Arial"/>
-          <w:color w:val="000000" w:themeColor="text1"/>
-          <w:sz w:val="24"/>
-          <w:szCs w:val="24"/>
-          <w:lang w:eastAsia="es-CO"/>
-        </w:rPr>
-      </w:pPr>
-      <w:r>
-        <w:rPr>
-          <w:rFonts w:ascii="Arial" w:eastAsia="Times New Roman" w:hAnsi="Arial" w:cs="Arial"/>
-          <w:b/>
-          <w:bCs/>
-          <w:color w:val="000000" w:themeColor="text1"/>
-          <w:sz w:val="24"/>
-          <w:szCs w:val="24"/>
-          <w:lang w:eastAsia="es-CO"/>
-        </w:rPr>
         <w:t>Reglas de Negocio:</w:t>
       </w:r>
     </w:p>
@@ -12815,9 +12693,6 @@
         <w:t xml:space="preserve">2.2.2 </w:t>
       </w:r>
       <w:r>
-        <w:rPr>
-          <w:highlight w:val="yellow"/>
-        </w:rPr>
         <w:t>Consulta de Bonificación - Período Actual</w:t>
       </w:r>
     </w:p>
@@ -14034,8 +13909,6 @@
       <w:r>
         <w:t xml:space="preserve">2.2.3 </w:t>
       </w:r>
-      <w:bookmarkStart w:id="0" w:name="_GoBack"/>
-      <w:bookmarkEnd w:id="0"/>
       <w:r>
         <w:t>Notificaciones Automáticas Integradas:</w:t>
       </w:r>
@@ -15094,7 +14967,13 @@
         <w:pStyle w:val="Ttulo4"/>
       </w:pPr>
       <w:r>
-        <w:t>2.2.3 Consulta de Histórico de Bonos - Períodos Anteriores</w:t>
+        <w:t>2.2.4</w:t>
+      </w:r>
+      <w:r>
+        <w:t xml:space="preserve"> </w:t>
+      </w:r>
+      <w:r>
+        <w:t>Consulta de Histórico de Bonos - Períodos Anteriores</w:t>
       </w:r>
     </w:p>
     <w:p>
@@ -16121,7 +16000,10 @@
       </w:pPr>
       <w:r>
         <w:lastRenderedPageBreak/>
-        <w:t xml:space="preserve">2.3 Módulo de Integraciones (Automático - </w:t>
+        <w:t xml:space="preserve">2.3 </w:t>
+      </w:r>
+      <w:r>
+        <w:t xml:space="preserve">Módulo de Integraciones (Automático - </w:t>
       </w:r>
       <w:proofErr w:type="spellStart"/>
       <w:r>
@@ -16161,9 +16043,6 @@
         <w:t xml:space="preserve">2.3.1 </w:t>
       </w:r>
       <w:r>
-        <w:rPr>
-          <w:highlight w:val="yellow"/>
-        </w:rPr>
         <w:t>Obtener Facturación de TOTUS</w:t>
       </w:r>
     </w:p>
@@ -17635,7 +17514,10 @@
         <w:pStyle w:val="Ttulo3"/>
       </w:pPr>
       <w:r>
-        <w:t>2.3.2 Cargar Lista de Precios (Diario Automático)</w:t>
+        <w:t xml:space="preserve">2.3.2 </w:t>
+      </w:r>
+      <w:r>
+        <w:t>Cargar Lista de Precios (Diario Automático)</w:t>
       </w:r>
     </w:p>
     <w:p>
@@ -18655,7 +18537,10 @@
         <w:pStyle w:val="Ttulo3"/>
       </w:pPr>
       <w:r>
-        <w:t>2.3.3 Cierre Automático de Instancia de Período</w:t>
+        <w:t xml:space="preserve">2.3.3 </w:t>
+      </w:r>
+      <w:r>
+        <w:t>Cierre Automático de Instancia de Período</w:t>
       </w:r>
     </w:p>
     <w:p>
@@ -19563,7 +19448,10 @@
         <w:pStyle w:val="Ttulo3"/>
       </w:pPr>
       <w:r>
-        <w:t xml:space="preserve">2.4 Módulo de Operaciones Manuales (Usuario PROMOS - </w:t>
+        <w:t xml:space="preserve">2.4 </w:t>
+      </w:r>
+      <w:r>
+        <w:t xml:space="preserve">Módulo de Operaciones Manuales (Usuario PROMOS - </w:t>
       </w:r>
       <w:proofErr w:type="spellStart"/>
       <w:r>
@@ -19603,7 +19491,13 @@
         <w:pStyle w:val="Ttulo4"/>
       </w:pPr>
       <w:r>
-        <w:t xml:space="preserve">2.4.1 Consultar Bono Actual Dinámico </w:t>
+        <w:t xml:space="preserve">2.4.1 </w:t>
+      </w:r>
+      <w:r>
+        <w:t>Consultar Bono Actual Dinámico</w:t>
+      </w:r>
+      <w:r>
+        <w:t xml:space="preserve"> </w:t>
       </w:r>
     </w:p>
     <w:p>
@@ -20484,15 +20378,9 @@
         <w:t xml:space="preserve">2.4.2 </w:t>
       </w:r>
       <w:r>
-        <w:rPr>
-          <w:highlight w:val="yellow"/>
-        </w:rPr>
         <w:t xml:space="preserve">Gestión </w:t>
       </w:r>
       <w:r>
-        <w:rPr>
-          <w:highlight w:val="yellow"/>
-        </w:rPr>
         <w:t>de Órdenes de Compra Especiales</w:t>
       </w:r>
     </w:p>
@@ -21685,9 +21573,6 @@
         <w:t xml:space="preserve">2.4.3 </w:t>
       </w:r>
       <w:r>
-        <w:rPr>
-          <w:highlight w:val="yellow"/>
-        </w:rPr>
         <w:t>Reconciliación de Nota de Crédito</w:t>
       </w:r>
     </w:p>
@@ -23115,7 +23000,10 @@
         <w:pStyle w:val="Ttulo3"/>
       </w:pPr>
       <w:r>
-        <w:t xml:space="preserve">2.5 Módulo de Reportería (Usuario PROMOS - </w:t>
+        <w:t xml:space="preserve">2.5 </w:t>
+      </w:r>
+      <w:r>
+        <w:t xml:space="preserve">Módulo de Reportería (Usuario PROMOS - </w:t>
       </w:r>
       <w:proofErr w:type="spellStart"/>
       <w:r>
@@ -23209,7 +23097,13 @@
       </w:pPr>
       <w:r>
         <w:lastRenderedPageBreak/>
-        <w:t>2.5.1 Reporte: Bonos Calculados vs Bonos Aplicados</w:t>
+        <w:t xml:space="preserve">2.5.1 </w:t>
+      </w:r>
+      <w:r>
+        <w:t>Reporte:</w:t>
+      </w:r>
+      <w:r>
+        <w:t xml:space="preserve"> </w:t>
       </w:r>
     </w:p>
     <w:p>
@@ -23645,7 +23539,10 @@
         <w:pStyle w:val="Ttulo4"/>
       </w:pPr>
       <w:r>
-        <w:t>2.5.2 Reporte: Distribuidores que Consultaron Bonos</w:t>
+        <w:t xml:space="preserve">2.5.2 </w:t>
+      </w:r>
+      <w:r>
+        <w:t>Reporte: Distribuidores que Consultaron Bonos</w:t>
       </w:r>
     </w:p>
     <w:p>
@@ -24029,7 +23926,10 @@
       </w:pPr>
       <w:r>
         <w:lastRenderedPageBreak/>
-        <w:t>2.5.3 Reporte: Discrepancias de NC (Calculada vs Real)</w:t>
+        <w:t>2.5.</w:t>
+      </w:r>
+      <w:r>
+        <w:t>3 Reporte: Discrepancias de NC (Calculada vs Real)</w:t>
       </w:r>
     </w:p>
     <w:p>
@@ -24519,7 +24419,10 @@
         <w:pStyle w:val="Ttulo4"/>
       </w:pPr>
       <w:r>
-        <w:t>2.5.4 Reporte: Auditoría de Acciones del Usuario PROMOS</w:t>
+        <w:t xml:space="preserve">2.5.4 </w:t>
+      </w:r>
+      <w:r>
+        <w:t>Reporte: Auditoría de Acciones del Usuario PROMOS</w:t>
       </w:r>
     </w:p>
     <w:p>
@@ -24951,7 +24854,10 @@
         <w:pStyle w:val="Ttulo4"/>
       </w:pPr>
       <w:r>
-        <w:t>2.5.5 Reporte: Precios y Vigencias Usados en Período</w:t>
+        <w:t xml:space="preserve">2.5.5 </w:t>
+      </w:r>
+      <w:r>
+        <w:t>Reporte: Precios y Vigencias Usados en Período</w:t>
       </w:r>
     </w:p>
     <w:p>
@@ -25463,7 +25369,10 @@
         <w:pStyle w:val="Ttulo4"/>
       </w:pPr>
       <w:r>
-        <w:t>2.5.6 Reporte: Ingresos Manuales Aplicados</w:t>
+        <w:t>2.5.</w:t>
+      </w:r>
+      <w:r>
+        <w:t>6 Reporte: Ingresos Manuales Aplicados</w:t>
       </w:r>
     </w:p>
     <w:p>
@@ -25907,6 +25816,18 @@
     </w:p>
     <w:p>
       <w:pPr>
+        <w:pStyle w:val="Prrafodelista"/>
+        <w:rPr>
+          <w:rFonts w:ascii="Arial" w:eastAsia="Times New Roman" w:hAnsi="Arial" w:cs="Arial"/>
+          <w:color w:val="000000" w:themeColor="text1"/>
+          <w:sz w:val="24"/>
+          <w:szCs w:val="24"/>
+          <w:lang w:eastAsia="es-CO"/>
+        </w:rPr>
+      </w:pPr>
+    </w:p>
+    <w:p>
+      <w:pPr>
         <w:pStyle w:val="Ttulo2"/>
       </w:pPr>
       <w:r>
@@ -26501,6 +26422,19 @@
     <w:p>
       <w:pPr>
         <w:pStyle w:val="Prrafodelista"/>
+        <w:ind w:left="1418"/>
+        <w:rPr>
+          <w:rFonts w:ascii="Arial" w:eastAsia="Times New Roman" w:hAnsi="Arial" w:cs="Arial"/>
+          <w:color w:val="000000" w:themeColor="text1"/>
+          <w:sz w:val="24"/>
+          <w:szCs w:val="24"/>
+          <w:lang w:eastAsia="es-CO"/>
+        </w:rPr>
+      </w:pPr>
+    </w:p>
+    <w:p>
+      <w:pPr>
+        <w:pStyle w:val="Prrafodelista"/>
         <w:numPr>
           <w:ilvl w:val="0"/>
           <w:numId w:val="85"/>
@@ -26523,6 +26457,7 @@
           <w:szCs w:val="24"/>
           <w:lang w:eastAsia="es-CO"/>
         </w:rPr>
+        <w:lastRenderedPageBreak/>
         <w:t>Auditoría de Ingresos Manuales</w:t>
       </w:r>
       <w:r>
@@ -26587,7 +26522,6 @@
           <w:szCs w:val="24"/>
           <w:lang w:eastAsia="es-CO"/>
         </w:rPr>
-        <w:lastRenderedPageBreak/>
         <w:t>Reconciliaciones de NC realizadas</w:t>
       </w:r>
     </w:p>
@@ -27185,6 +27119,7 @@
           <w:lang w:eastAsia="es-CO"/>
         </w:rPr>
       </w:pPr>
+      <w:bookmarkStart w:id="0" w:name="_GoBack"/>
       <w:r>
         <w:rPr>
           <w:noProof/>
@@ -27192,8 +27127,8 @@
         </w:rPr>
         <w:drawing>
           <wp:inline distT="0" distB="0" distL="0" distR="0" wp14:anchorId="5870FC6B" wp14:editId="21077ED9">
-            <wp:extent cx="3101607" cy="2857500"/>
-            <wp:effectExtent l="0" t="0" r="3810" b="0"/>
+            <wp:extent cx="2905172" cy="2676525"/>
+            <wp:effectExtent l="0" t="0" r="9525" b="0"/>
             <wp:docPr id="25" name="Imagen 25"/>
             <wp:cNvGraphicFramePr>
               <a:graphicFrameLocks xmlns:a="http://schemas.openxmlformats.org/drawingml/2006/main" noChangeAspect="1"/>
@@ -27214,7 +27149,7 @@
                   <pic:spPr>
                     <a:xfrm>
                       <a:off x="0" y="0"/>
-                      <a:ext cx="3154230" cy="2905981"/>
+                      <a:ext cx="2991537" cy="2756093"/>
                     </a:xfrm>
                     <a:prstGeom prst="rect">
                       <a:avLst/>
@@ -27226,6 +27161,7 @@
           </wp:inline>
         </w:drawing>
       </w:r>
+      <w:bookmarkEnd w:id="0"/>
     </w:p>
     <w:p>
       <w:pPr>
@@ -28098,52 +28034,18 @@
           <w:color w:val="000000" w:themeColor="text1"/>
           <w:sz w:val="24"/>
           <w:szCs w:val="24"/>
-          <w:lang w:eastAsia="es-CO"/>
-        </w:rPr>
-      </w:pPr>
-      <w:proofErr w:type="spellStart"/>
-      <w:r>
-        <w:rPr>
-          <w:rFonts w:ascii="Arial" w:eastAsia="Times New Roman" w:hAnsi="Arial" w:cs="Arial"/>
-          <w:color w:val="000000" w:themeColor="text1"/>
-          <w:sz w:val="24"/>
-          <w:szCs w:val="24"/>
-          <w:lang w:eastAsia="es-CO"/>
-        </w:rPr>
-        <w:t>Connection</w:t>
-      </w:r>
-      <w:proofErr w:type="spellEnd"/>
-      <w:r>
-        <w:rPr>
-          <w:rFonts w:ascii="Arial" w:eastAsia="Times New Roman" w:hAnsi="Arial" w:cs="Arial"/>
-          <w:color w:val="000000" w:themeColor="text1"/>
-          <w:sz w:val="24"/>
-          <w:szCs w:val="24"/>
-          <w:lang w:eastAsia="es-CO"/>
-        </w:rPr>
-        <w:t xml:space="preserve"> </w:t>
-      </w:r>
-      <w:proofErr w:type="spellStart"/>
-      <w:r>
-        <w:rPr>
-          <w:rFonts w:ascii="Arial" w:eastAsia="Times New Roman" w:hAnsi="Arial" w:cs="Arial"/>
-          <w:color w:val="000000" w:themeColor="text1"/>
-          <w:sz w:val="24"/>
-          <w:szCs w:val="24"/>
-          <w:lang w:eastAsia="es-CO"/>
-        </w:rPr>
-        <w:t>pooling</w:t>
-      </w:r>
-      <w:proofErr w:type="spellEnd"/>
-      <w:r>
-        <w:rPr>
-          <w:rFonts w:ascii="Arial" w:eastAsia="Times New Roman" w:hAnsi="Arial" w:cs="Arial"/>
-          <w:color w:val="000000" w:themeColor="text1"/>
-          <w:sz w:val="24"/>
-          <w:szCs w:val="24"/>
-          <w:lang w:eastAsia="es-CO"/>
-        </w:rPr>
-        <w:t xml:space="preserve"> para consultas a TOTUS</w:t>
+          <w:lang w:val="en-US" w:eastAsia="es-CO"/>
+        </w:rPr>
+      </w:pPr>
+      <w:r>
+        <w:rPr>
+          <w:rFonts w:ascii="Arial" w:eastAsia="Times New Roman" w:hAnsi="Arial" w:cs="Arial"/>
+          <w:color w:val="000000" w:themeColor="text1"/>
+          <w:sz w:val="24"/>
+          <w:szCs w:val="24"/>
+          <w:lang w:val="en-US" w:eastAsia="es-CO"/>
+        </w:rPr>
+        <w:t>Connection pooling para consultas a TOTUS</w:t>
       </w:r>
     </w:p>
     <w:p>
@@ -46921,7 +46823,7 @@
 </file>
 
 <file path=customXml/itemProps1.xml><?xml version="1.0" encoding="utf-8"?>
-<ds:datastoreItem xmlns:ds="http://schemas.openxmlformats.org/officeDocument/2006/customXml" ds:itemID="{70FDA5F2-C684-4298-A227-E296DC7CB6A1}">
+<ds:datastoreItem xmlns:ds="http://schemas.openxmlformats.org/officeDocument/2006/customXml" ds:itemID="{1751FBA5-68DF-4593-AB78-89099977E7EE}">
   <ds:schemaRefs>
     <ds:schemaRef ds:uri="http://schemas.openxmlformats.org/officeDocument/2006/bibliography"/>
   </ds:schemaRefs>

</xml_diff>